<commit_message>
docs(libro): rimossa la sinossi dal libro
</commit_message>
<xml_diff>
--- a/docs/libro/libro.docx
+++ b/docs/libro/libro.docx
@@ -13,75 +13,6 @@
       <w:r>
         <w:rPr/>
         <w:t xml:space="preserve"/>
-      </w:r>
-    </w:p>
-    <w:p>
-      <w:pPr>
-        <w:pStyle w:val="Heading1"/>
-        <w:spacing w:lineRule="auto"/>
-      </w:pPr>
-      <w:r>
-        <w:rPr/>
-        <w:t xml:space="preserve">Sinossi</w:t>
-      </w:r>
-    </w:p>
-    <w:p>
-      <w:pPr>
-        <w:spacing w:lineRule="auto"/>
-      </w:pPr>
-      <w:r>
-        <w:rPr/>
-        <w:t xml:space="preserve">Triad è un linguaggio di programmazione autonomo, definito da una specifica normativa   indipendente da qualsiasi implementazione. Questo libro ne è il percorso di studio: dai primi   programmi al seed in codice macchina, dalle operazioni aritmetiche e sulle stringhe alla   unificazione con occurs-check, dal controllo di flusso alla metaprogrammazione.</w:t>
-      </w:r>
-    </w:p>
-    <w:p>
-      <w:pPr>
-        <w:spacing w:lineRule="auto"/>
-      </w:pPr>
-      <w:r>
-        <w:rPr/>
-        <w:t xml:space="preserve">Il volume presenta il linguaggio in quattro parti. </w:t>
-      </w:r>
-      <w:r>
-        <w:rPr/>
-        <w:t xml:space="preserve">Fondamenti</w:t>
-      </w:r>
-      <w:r>
-        <w:rPr/>
-        <w:t xml:space="preserve"> introduce il lessico,   i valori e i tipi, il controllo di flusso, le funzioni, il dispatch, la logica, il codice come   dato, gli errori, i contratti, il budget, le tracce e gli effetti. </w:t>
-      </w:r>
-      <w:r>
-        <w:rPr/>
-        <w:t xml:space="preserve">Triad-Core</w:t>
-      </w:r>
-      <w:r>
-        <w:rPr/>
-        <w:t xml:space="preserve"> copre il   sottoinsieme eseguibile oggi dall'interprete di riferimento, con tutti i 37 casi di conformance.   </w:t>
-      </w:r>
-      <w:r>
-        <w:rPr/>
-        <w:t xml:space="preserve">Triad-Full</w:t>
-      </w:r>
-      <w:r>
-        <w:rPr/>
-        <w:t xml:space="preserve"> presenta i costrutti dello standard completo, oggi studiabili ma non ancora   eseguibili dal runtime. </w:t>
-      </w:r>
-      <w:r>
-        <w:rPr/>
-        <w:t xml:space="preserve">Dentro il progetto</w:t>
-      </w:r>
-      <w:r>
-        <w:rPr/>
-        <w:t xml:space="preserve"> accompagna il lettore nel codice del   repository: il seed, la suite di conformance, la CLI, gli strumenti per gli editor.</w:t>
-      </w:r>
-    </w:p>
-    <w:p>
-      <w:pPr>
-        <w:spacing w:lineRule="auto"/>
-      </w:pPr>
-      <w:r>
-        <w:rPr/>
-        <w:t xml:space="preserve">Il lettore troverà spiegazioni, esempi ed esercizi, con marcatori [Core] e [Full] che indicano   in quale profilo esiste ciascun costrutto. Il manuale non è un riassunto della specifica: è un   percorso di studio, mentre SPEC.md e SPEC-CORE.md restano la fonte di verità normativa.</w:t>
       </w:r>
     </w:p>
     <w:p>
@@ -27925,12 +27856,12 @@
           <wp:inline distB="0" distL="0" distR="0" distT="0">
             <wp:extent cx="5943600" cy="5943600"/>
             <wp:effectExtent b="0" l="0" r="0" t="0"/>
-            <wp:docPr id="1" name="image-U1BG7Fmicmc1PXiHfvumC.webp"/>
+            <wp:docPr id="1" name="image-o7KTuH19nM9OddadUfep4.webp"/>
             <a:graphic>
               <a:graphicData uri="http://schemas.openxmlformats.org/drawingml/2006/picture">
                 <pic:pic>
                   <pic:nvPicPr>
-                    <pic:cNvPr id="1" name="image-U1BG7Fmicmc1PXiHfvumC.webp" descr="Logo di Triad"/>
+                    <pic:cNvPr id="1" name="image-o7KTuH19nM9OddadUfep4.webp" descr="Logo di Triad"/>
                     <pic:cNvPicPr/>
                   </pic:nvPicPr>
                   <pic:blipFill>

</xml_diff>

<commit_message>
docs(libro): copertina full-bleed (immagine a tutta pagina)
</commit_message>
<xml_diff>
--- a/docs/libro/libro.docx
+++ b/docs/libro/libro.docx
@@ -27856,12 +27856,12 @@
           <wp:inline distB="0" distL="0" distR="0" distT="0">
             <wp:extent cx="5943600" cy="5943600"/>
             <wp:effectExtent b="0" l="0" r="0" t="0"/>
-            <wp:docPr id="1" name="image-o7KTuH19nM9OddadUfep4.webp"/>
+            <wp:docPr id="1" name="image-vX_0F6SftmaASjq5eXaN7.webp"/>
             <a:graphic>
               <a:graphicData uri="http://schemas.openxmlformats.org/drawingml/2006/picture">
                 <pic:pic>
                   <pic:nvPicPr>
-                    <pic:cNvPr id="1" name="image-o7KTuH19nM9OddadUfep4.webp" descr="Logo di Triad"/>
+                    <pic:cNvPr id="1" name="image-vX_0F6SftmaASjq5eXaN7.webp" descr="Logo di Triad"/>
                     <pic:cNvPicPr/>
                   </pic:nvPicPr>
                   <pic:blipFill>

</xml_diff>

<commit_message>
docs(libro): aggiunta Prefazione all inizio del libro
</commit_message>
<xml_diff>
--- a/docs/libro/libro.docx
+++ b/docs/libro/libro.docx
@@ -13,6 +13,156 @@
       <w:r>
         <w:rPr/>
         <w:t xml:space="preserve"/>
+      </w:r>
+    </w:p>
+    <w:p>
+      <w:pPr>
+        <w:pStyle w:val="Heading1"/>
+        <w:spacing w:lineRule="auto"/>
+      </w:pPr>
+      <w:r>
+        <w:rPr/>
+        <w:t xml:space="preserve">Prefazione</w:t>
+      </w:r>
+    </w:p>
+    <w:p>
+      <w:pPr>
+        <w:spacing w:lineRule="auto"/>
+      </w:pPr>
+      <w:r>
+        <w:rPr/>
+        <w:t xml:space="preserve">Triad è un linguaggio di programmazione autonomo: sintassi a blocchi e tipi dichiarati, multiple dispatch, programmazione logica integrata, codice come dato. La sua definizione è una specifica normativa indipendente dall'implementazione, accompagnata da una specifica eseguibile e da una suite di conformità con golden verificabili. Questo libro ne è il percorso di studio.</w:t>
+      </w:r>
+    </w:p>
+    <w:p>
+      <w:pPr>
+        <w:spacing w:lineRule="auto"/>
+      </w:pPr>
+      <w:r>
+        <w:rPr/>
+        <w:t xml:space="preserve">Il libro nasce da un'esigenza semplice: imparare Triad non significa solo leggere la specifica, ma costruire un modello mentale del linguaggio, dei suoi costrutti e del suo runtime. La specifica è normativa e precisa, ma è scritta per essere implementata, non per essere letta come un romanzo. Questo volume la traduce in un percorso: spiegazioni, esempi, esercizi, marcatori di profilo.</w:t>
+      </w:r>
+    </w:p>
+    <w:p>
+      <w:pPr>
+        <w:spacing w:lineRule="auto"/>
+      </w:pPr>
+      <w:r>
+        <w:rPr/>
+        <w:t xml:space="preserve">Il lettore ideale sa già programmare in un altro linguaggio: sa cosa sono una variabile, una funzione, un ciclo, una ricorsione. Questo libro non insegna la programmazione in generale, insegna Triad. Le influenze del linguaggio (Julia, Prolog, Lisp) sono documentate nell'Appendice A della specifica: sono note informative, non definizioni. Triad non è un dialetto di nessuno dei tre.</w:t>
+      </w:r>
+    </w:p>
+    <w:p>
+      <w:pPr>
+        <w:spacing w:lineRule="auto"/>
+      </w:pPr>
+      <w:r>
+        <w:rPr/>
+        <w:t xml:space="preserve">Il volume è organizzato in quattro parti. La prima, </w:t>
+      </w:r>
+      <w:r>
+        <w:rPr/>
+        <w:t xml:space="preserve">Fondamenti</w:t>
+      </w:r>
+      <w:r>
+        <w:rPr/>
+        <w:t xml:space="preserve">, introduce il lessico, i valori e i tipi, il controllo di flusso, le funzioni, il dispatch, la logica, il codice come dato, gli errori, i contratti, il budget, le tracce e gli effetti. La seconda, </w:t>
+      </w:r>
+      <w:r>
+        <w:rPr/>
+        <w:t xml:space="preserve">Triad-Core</w:t>
+      </w:r>
+      <w:r>
+        <w:rPr/>
+        <w:t xml:space="preserve">, copre il sottoinsieme eseguibile oggi dall'interprete di riferimento, con tutti i 37 casi di conformance. La terza, </w:t>
+      </w:r>
+      <w:r>
+        <w:rPr/>
+        <w:t xml:space="preserve">Triad-Full</w:t>
+      </w:r>
+      <w:r>
+        <w:rPr/>
+        <w:t xml:space="preserve">, presenta i costrutti dello standard completo, oggi studiabili ma non ancora eseguibili dal runtime corrente. La quarta, </w:t>
+      </w:r>
+      <w:r>
+        <w:rPr/>
+        <w:t xml:space="preserve">Dentro il progetto</w:t>
+      </w:r>
+      <w:r>
+        <w:rPr/>
+        <w:t xml:space="preserve">, accompagna il lettore nel codice del repository: il seed in codice macchina, la suite di conformance, la CLI, gli strumenti per gli editor.</w:t>
+      </w:r>
+    </w:p>
+    <w:p>
+      <w:pPr>
+        <w:spacing w:lineRule="auto"/>
+      </w:pPr>
+      <w:r>
+        <w:rPr/>
+        <w:t xml:space="preserve">Due profili di conformità attraversano tutto il libro. Triad-Core è il sottoinsieme di bootstrap: valori, funzioni, chiusure, controllo di flusso, liste, stringhe, I/O. Triad-Full è lo standard completo. Ogni programma Core è anche un programma Full valido e deve comportarsi allo stesso modo. I marcatori </w:t>
+      </w:r>
+      <w:r>
+        <w:rPr>
+          <w:b/>
+        </w:rPr>
+        <w:t xml:space="preserve">[Core]</w:t>
+      </w:r>
+      <w:r>
+        <w:rPr/>
+        <w:t xml:space="preserve"> e </w:t>
+      </w:r>
+      <w:r>
+        <w:rPr>
+          <w:b/>
+        </w:rPr>
+        <w:t xml:space="preserve">[Full]</w:t>
+      </w:r>
+      <w:r>
+        <w:rPr/>
+        <w:t xml:space="preserve"> indicano in quale profilo esiste ciascun costrutto; i blocchi di codice sono marcati </w:t>
+      </w:r>
+      <w:r>
+        <w:rPr/>
+        <w:t xml:space="preserve">triad</w:t>
+      </w:r>
+      <w:r>
+        <w:rPr/>
+        <w:t xml:space="preserve"> (eseguibile oggi) o </w:t>
+      </w:r>
+      <w:r>
+        <w:rPr/>
+        <w:t xml:space="preserve">triad-full</w:t>
+      </w:r>
+      <w:r>
+        <w:rPr/>
+        <w:t xml:space="preserve"> (specificato ma non ancora eseguibile).</w:t>
+      </w:r>
+    </w:p>
+    <w:p>
+      <w:pPr>
+        <w:spacing w:lineRule="auto"/>
+      </w:pPr>
+      <w:r>
+        <w:rPr/>
+        <w:t xml:space="preserve">Il runtime di riferimento è il seed S0: un interprete Triad-Core scritto direttamente in codice macchina x86-64, senza alcun linguaggio ospite. Il piano di bootstrap prevede S1 (un interprete Triad scritto in Triad-Core), S2 (compilatore nativo), S3 (self-hosting) e S4 (parità cross-platform). Il libro riflette questo stato: dove il runtime non copre un costrutto, il testo lo dice esplicitamente.</w:t>
+      </w:r>
+    </w:p>
+    <w:p>
+      <w:pPr>
+        <w:spacing w:lineRule="auto"/>
+      </w:pPr>
+      <w:r>
+        <w:rPr/>
+        <w:t xml:space="preserve">Buona lettura, e buon codice.</w:t>
+      </w:r>
+    </w:p>
+    <w:p>
+      <w:pPr>
+        <w:spacing w:lineRule="auto"/>
+      </w:pPr>
+      <w:r>
+        <w:rPr/>
+        <w:t xml:space="preserve">— GPuntobit</w:t>
       </w:r>
     </w:p>
     <w:p>
@@ -26608,12 +26758,12 @@
           <wp:inline distB="0" distL="0" distR="0" distT="0">
             <wp:extent cx="5943600" cy="5943600"/>
             <wp:effectExtent b="0" l="0" r="0" t="0"/>
-            <wp:docPr id="1" name="image-vAUttz7HGu1g8Z1YV76F7.webp"/>
+            <wp:docPr id="1" name="image-n4uvOdGanwQ3WFKr8IZlO.webp"/>
             <a:graphic>
               <a:graphicData uri="http://schemas.openxmlformats.org/drawingml/2006/picture">
                 <pic:pic>
                   <pic:nvPicPr>
-                    <pic:cNvPr id="1" name="image-vAUttz7HGu1g8Z1YV76F7.webp" descr="Logo di Triad"/>
+                    <pic:cNvPr id="1" name="image-n4uvOdGanwQ3WFKr8IZlO.webp" descr="Logo di Triad"/>
                     <pic:cNvPicPr/>
                   </pic:nvPicPr>
                   <pic:blipFill>

</xml_diff>

<commit_message>
docs(libro): formato standard 6x9 (Amazon KDP) per copertina e libro
</commit_message>
<xml_diff>
--- a/docs/libro/libro.docx
+++ b/docs/libro/libro.docx
@@ -26758,12 +26758,12 @@
           <wp:inline distB="0" distL="0" distR="0" distT="0">
             <wp:extent cx="5943600" cy="5943600"/>
             <wp:effectExtent b="0" l="0" r="0" t="0"/>
-            <wp:docPr id="1" name="image-n4uvOdGanwQ3WFKr8IZlO.webp"/>
+            <wp:docPr id="1" name="image-xXx5bLhF76rirYrpwWUMh.webp"/>
             <a:graphic>
               <a:graphicData uri="http://schemas.openxmlformats.org/drawingml/2006/picture">
                 <pic:pic>
                   <pic:nvPicPr>
-                    <pic:cNvPr id="1" name="image-n4uvOdGanwQ3WFKr8IZlO.webp" descr="Logo di Triad"/>
+                    <pic:cNvPr id="1" name="image-xXx5bLhF76rirYrpwWUMh.webp" descr="Logo di Triad"/>
                     <pic:cNvPicPr/>
                   </pic:nvPicPr>
                   <pic:blipFill>

</xml_diff>

<commit_message>
docs(libro): copertina migliorata (glow logo) + impaginazione (indent, orphans)
</commit_message>
<xml_diff>
--- a/docs/libro/libro.docx
+++ b/docs/libro/libro.docx
@@ -26729,12 +26729,12 @@
           <wp:inline distB="0" distL="0" distR="0" distT="0">
             <wp:extent cx="5943600" cy="5943600"/>
             <wp:effectExtent b="0" l="0" r="0" t="0"/>
-            <wp:docPr id="1" name="image-xS0CmUwRsBiPICBamUGER.webp"/>
+            <wp:docPr id="1" name="image-9pnJiGJUr59UfnP53niCa.webp"/>
             <a:graphic>
               <a:graphicData uri="http://schemas.openxmlformats.org/drawingml/2006/picture">
                 <pic:pic>
                   <pic:nvPicPr>
-                    <pic:cNvPr id="1" name="image-xS0CmUwRsBiPICBamUGER.webp" descr="Logo di Triad"/>
+                    <pic:cNvPr id="1" name="image-9pnJiGJUr59UfnP53niCa.webp" descr="Logo di Triad"/>
                     <pic:cNvPicPr/>
                   </pic:nvPicPr>
                   <pic:blipFill>

</xml_diff>

<commit_message>
docs(libro): docx migliorato (font, pagina 6x9, numeri pagina, margini)
</commit_message>
<xml_diff>
--- a/docs/libro/libro.docx
+++ b/docs/libro/libro.docx
@@ -3,8 +3,8 @@
 <w:document xmlns:a="http://schemas.openxmlformats.org/drawingml/2006/main" xmlns:cdr="http://schemas.openxmlformats.org/drawingml/2006/chartDrawing" xmlns:o="urn:schemas-microsoft-com:office:office" xmlns:pic="http://schemas.openxmlformats.org/drawingml/2006/picture" xmlns:r="http://schemas.openxmlformats.org/officeDocument/2006/relationships" xmlns:v="urn:schemas-microsoft-com:vml" xmlns:ve="http://schemas.openxmlformats.org/markup-compatibility/2006" xmlns:vt="http://schemas.openxmlformats.org/officeDocument/2006/docPropsVTypes" xmlns:w="http://schemas.openxmlformats.org/wordprocessingml/2006/main" xmlns:w10="urn:schemas-microsoft-com:office:word" xmlns:wp="http://schemas.openxmlformats.org/drawingml/2006/wordprocessingDrawing" xmlns:wne="http://schemas.microsoft.com/office/word/2006/wordml">
   <w:body>
     <w:sectPr>
-      <w:pgSz w:w="12240" w:h="15840" w:orient="portrait"/>
-      <w:pgMar w:top="1440" w:right="1440" w:bottom="1440" w:left="1440" w:header="undefined" w:footer="undefined" w:gutter="undefined"/>
+      <w:pgSz w:w="8640" w:h="12960" w:orient="portrait"/>
+      <w:pgMar w:top="850" w:right="680" w:bottom="850" w:left="680" w:header="undefined" w:footer="undefined" w:gutter="undefined"/>
     </w:sectPr>
     <w:p>
       <w:pPr>
@@ -323,9 +323,9 @@
         <w:jc w:val="center"/>
       </w:tblPr>
       <w:tblGrid>
-        <w:gridCol w:w="3120"/>
-        <w:gridCol w:w="3120"/>
-        <w:gridCol w:w="3120"/>
+        <w:gridCol w:w="2426.6666666666665"/>
+        <w:gridCol w:w="2426.6666666666665"/>
+        <w:gridCol w:w="2426.6666666666665"/>
       </w:tblGrid>
       <w:tr>
         <w:trPr/>
@@ -388,9 +388,9 @@
         </w:tc>
       </w:tr>
       <w:tblGrid>
-        <w:gridCol w:w="3120"/>
-        <w:gridCol w:w="3120"/>
-        <w:gridCol w:w="3120"/>
+        <w:gridCol w:w="2426.6666666666665"/>
+        <w:gridCol w:w="2426.6666666666665"/>
+        <w:gridCol w:w="2426.6666666666665"/>
       </w:tblGrid>
       <w:tr>
         <w:trPr/>
@@ -637,8 +637,8 @@
         <w:jc w:val="center"/>
       </w:tblPr>
       <w:tblGrid>
-        <w:gridCol w:w="4680"/>
-        <w:gridCol w:w="4680"/>
+        <w:gridCol w:w="3640"/>
+        <w:gridCol w:w="3640"/>
       </w:tblGrid>
       <w:tr>
         <w:trPr/>
@@ -682,8 +682,8 @@
         </w:tc>
       </w:tr>
       <w:tblGrid>
-        <w:gridCol w:w="4680"/>
-        <w:gridCol w:w="4680"/>
+        <w:gridCol w:w="3640"/>
+        <w:gridCol w:w="3640"/>
       </w:tblGrid>
       <w:tr>
         <w:trPr/>
@@ -913,8 +913,8 @@
         <w:jc w:val="center"/>
       </w:tblPr>
       <w:tblGrid>
-        <w:gridCol w:w="4680"/>
-        <w:gridCol w:w="4680"/>
+        <w:gridCol w:w="3640"/>
+        <w:gridCol w:w="3640"/>
       </w:tblGrid>
       <w:tr>
         <w:trPr/>
@@ -958,8 +958,8 @@
         </w:tc>
       </w:tr>
       <w:tblGrid>
-        <w:gridCol w:w="4680"/>
-        <w:gridCol w:w="4680"/>
+        <w:gridCol w:w="3640"/>
+        <w:gridCol w:w="3640"/>
       </w:tblGrid>
       <w:tr>
         <w:trPr/>
@@ -2052,8 +2052,8 @@
         <w:jc w:val="center"/>
       </w:tblPr>
       <w:tblGrid>
-        <w:gridCol w:w="4680"/>
-        <w:gridCol w:w="4680"/>
+        <w:gridCol w:w="3640"/>
+        <w:gridCol w:w="3640"/>
       </w:tblGrid>
       <w:tr>
         <w:trPr/>
@@ -2097,8 +2097,8 @@
         </w:tc>
       </w:tr>
       <w:tblGrid>
-        <w:gridCol w:w="4680"/>
-        <w:gridCol w:w="4680"/>
+        <w:gridCol w:w="3640"/>
+        <w:gridCol w:w="3640"/>
       </w:tblGrid>
       <w:tr>
         <w:trPr/>
@@ -2416,8 +2416,8 @@
         <w:jc w:val="center"/>
       </w:tblPr>
       <w:tblGrid>
-        <w:gridCol w:w="4680"/>
-        <w:gridCol w:w="4680"/>
+        <w:gridCol w:w="3640"/>
+        <w:gridCol w:w="3640"/>
       </w:tblGrid>
       <w:tr>
         <w:trPr/>
@@ -2461,8 +2461,8 @@
         </w:tc>
       </w:tr>
       <w:tblGrid>
-        <w:gridCol w:w="4680"/>
-        <w:gridCol w:w="4680"/>
+        <w:gridCol w:w="3640"/>
+        <w:gridCol w:w="3640"/>
       </w:tblGrid>
       <w:tr>
         <w:trPr/>
@@ -3307,9 +3307,9 @@
         <w:jc w:val="center"/>
       </w:tblPr>
       <w:tblGrid>
-        <w:gridCol w:w="3120"/>
-        <w:gridCol w:w="3120"/>
-        <w:gridCol w:w="3120"/>
+        <w:gridCol w:w="2426.6666666666665"/>
+        <w:gridCol w:w="2426.6666666666665"/>
+        <w:gridCol w:w="2426.6666666666665"/>
       </w:tblGrid>
       <w:tr>
         <w:trPr/>
@@ -3374,9 +3374,9 @@
         </w:tc>
       </w:tr>
       <w:tblGrid>
-        <w:gridCol w:w="3120"/>
-        <w:gridCol w:w="3120"/>
-        <w:gridCol w:w="3120"/>
+        <w:gridCol w:w="2426.6666666666665"/>
+        <w:gridCol w:w="2426.6666666666665"/>
+        <w:gridCol w:w="2426.6666666666665"/>
       </w:tblGrid>
       <w:tr>
         <w:trPr/>
@@ -5266,8 +5266,8 @@
         <w:jc w:val="center"/>
       </w:tblPr>
       <w:tblGrid>
-        <w:gridCol w:w="4680"/>
-        <w:gridCol w:w="4680"/>
+        <w:gridCol w:w="3640"/>
+        <w:gridCol w:w="3640"/>
       </w:tblGrid>
       <w:tr>
         <w:trPr/>
@@ -5311,8 +5311,8 @@
         </w:tc>
       </w:tr>
       <w:tblGrid>
-        <w:gridCol w:w="4680"/>
-        <w:gridCol w:w="4680"/>
+        <w:gridCol w:w="3640"/>
+        <w:gridCol w:w="3640"/>
       </w:tblGrid>
       <w:tr>
         <w:trPr/>
@@ -5991,9 +5991,9 @@
         <w:jc w:val="center"/>
       </w:tblPr>
       <w:tblGrid>
-        <w:gridCol w:w="3120"/>
-        <w:gridCol w:w="3120"/>
-        <w:gridCol w:w="3120"/>
+        <w:gridCol w:w="2426.6666666666665"/>
+        <w:gridCol w:w="2426.6666666666665"/>
+        <w:gridCol w:w="2426.6666666666665"/>
       </w:tblGrid>
       <w:tr>
         <w:trPr/>
@@ -6056,9 +6056,9 @@
         </w:tc>
       </w:tr>
       <w:tblGrid>
-        <w:gridCol w:w="3120"/>
-        <w:gridCol w:w="3120"/>
-        <w:gridCol w:w="3120"/>
+        <w:gridCol w:w="2426.6666666666665"/>
+        <w:gridCol w:w="2426.6666666666665"/>
+        <w:gridCol w:w="2426.6666666666665"/>
       </w:tblGrid>
       <w:tr>
         <w:trPr/>
@@ -9571,8 +9571,8 @@
         <w:jc w:val="center"/>
       </w:tblPr>
       <w:tblGrid>
-        <w:gridCol w:w="4680"/>
-        <w:gridCol w:w="4680"/>
+        <w:gridCol w:w="3640"/>
+        <w:gridCol w:w="3640"/>
       </w:tblGrid>
       <w:tr>
         <w:trPr/>
@@ -9616,8 +9616,8 @@
         </w:tc>
       </w:tr>
       <w:tblGrid>
-        <w:gridCol w:w="4680"/>
-        <w:gridCol w:w="4680"/>
+        <w:gridCol w:w="3640"/>
+        <w:gridCol w:w="3640"/>
       </w:tblGrid>
       <w:tr>
         <w:trPr/>
@@ -10280,8 +10280,8 @@
         <w:jc w:val="center"/>
       </w:tblPr>
       <w:tblGrid>
-        <w:gridCol w:w="4680"/>
-        <w:gridCol w:w="4680"/>
+        <w:gridCol w:w="3640"/>
+        <w:gridCol w:w="3640"/>
       </w:tblGrid>
       <w:tr>
         <w:trPr/>
@@ -10325,8 +10325,8 @@
         </w:tc>
       </w:tr>
       <w:tblGrid>
-        <w:gridCol w:w="4680"/>
-        <w:gridCol w:w="4680"/>
+        <w:gridCol w:w="3640"/>
+        <w:gridCol w:w="3640"/>
       </w:tblGrid>
       <w:tr>
         <w:trPr/>
@@ -10858,8 +10858,8 @@
         <w:jc w:val="center"/>
       </w:tblPr>
       <w:tblGrid>
-        <w:gridCol w:w="4680"/>
-        <w:gridCol w:w="4680"/>
+        <w:gridCol w:w="3640"/>
+        <w:gridCol w:w="3640"/>
       </w:tblGrid>
       <w:tr>
         <w:trPr/>
@@ -10903,8 +10903,8 @@
         </w:tc>
       </w:tr>
       <w:tblGrid>
-        <w:gridCol w:w="4680"/>
-        <w:gridCol w:w="4680"/>
+        <w:gridCol w:w="3640"/>
+        <w:gridCol w:w="3640"/>
       </w:tblGrid>
       <w:tr>
         <w:trPr/>
@@ -12557,9 +12557,9 @@
         <w:jc w:val="center"/>
       </w:tblPr>
       <w:tblGrid>
-        <w:gridCol w:w="3120"/>
-        <w:gridCol w:w="3120"/>
-        <w:gridCol w:w="3120"/>
+        <w:gridCol w:w="2426.6666666666665"/>
+        <w:gridCol w:w="2426.6666666666665"/>
+        <w:gridCol w:w="2426.6666666666665"/>
       </w:tblGrid>
       <w:tr>
         <w:trPr/>
@@ -12622,9 +12622,9 @@
         </w:tc>
       </w:tr>
       <w:tblGrid>
-        <w:gridCol w:w="3120"/>
-        <w:gridCol w:w="3120"/>
-        <w:gridCol w:w="3120"/>
+        <w:gridCol w:w="2426.6666666666665"/>
+        <w:gridCol w:w="2426.6666666666665"/>
+        <w:gridCol w:w="2426.6666666666665"/>
       </w:tblGrid>
       <w:tr>
         <w:trPr/>
@@ -13255,8 +13255,8 @@
         <w:jc w:val="center"/>
       </w:tblPr>
       <w:tblGrid>
-        <w:gridCol w:w="4680"/>
-        <w:gridCol w:w="4680"/>
+        <w:gridCol w:w="3640"/>
+        <w:gridCol w:w="3640"/>
       </w:tblGrid>
       <w:tr>
         <w:trPr/>
@@ -13300,8 +13300,8 @@
         </w:tc>
       </w:tr>
       <w:tblGrid>
-        <w:gridCol w:w="4680"/>
-        <w:gridCol w:w="4680"/>
+        <w:gridCol w:w="3640"/>
+        <w:gridCol w:w="3640"/>
       </w:tblGrid>
       <w:tr>
         <w:trPr/>
@@ -13986,8 +13986,8 @@
         <w:jc w:val="center"/>
       </w:tblPr>
       <w:tblGrid>
-        <w:gridCol w:w="4680"/>
-        <w:gridCol w:w="4680"/>
+        <w:gridCol w:w="3640"/>
+        <w:gridCol w:w="3640"/>
       </w:tblGrid>
       <w:tr>
         <w:trPr/>
@@ -14031,8 +14031,8 @@
         </w:tc>
       </w:tr>
       <w:tblGrid>
-        <w:gridCol w:w="4680"/>
-        <w:gridCol w:w="4680"/>
+        <w:gridCol w:w="3640"/>
+        <w:gridCol w:w="3640"/>
       </w:tblGrid>
       <w:tr>
         <w:trPr/>
@@ -15319,8 +15319,8 @@
         <w:jc w:val="center"/>
       </w:tblPr>
       <w:tblGrid>
-        <w:gridCol w:w="4680"/>
-        <w:gridCol w:w="4680"/>
+        <w:gridCol w:w="3640"/>
+        <w:gridCol w:w="3640"/>
       </w:tblGrid>
       <w:tr>
         <w:trPr/>
@@ -15364,8 +15364,8 @@
         </w:tc>
       </w:tr>
       <w:tblGrid>
-        <w:gridCol w:w="4680"/>
-        <w:gridCol w:w="4680"/>
+        <w:gridCol w:w="3640"/>
+        <w:gridCol w:w="3640"/>
       </w:tblGrid>
       <w:tr>
         <w:trPr/>
@@ -17080,8 +17080,8 @@
         <w:jc w:val="center"/>
       </w:tblPr>
       <w:tblGrid>
-        <w:gridCol w:w="4680"/>
-        <w:gridCol w:w="4680"/>
+        <w:gridCol w:w="3640"/>
+        <w:gridCol w:w="3640"/>
       </w:tblGrid>
       <w:tr>
         <w:trPr/>
@@ -17125,8 +17125,8 @@
         </w:tc>
       </w:tr>
       <w:tblGrid>
-        <w:gridCol w:w="4680"/>
-        <w:gridCol w:w="4680"/>
+        <w:gridCol w:w="3640"/>
+        <w:gridCol w:w="3640"/>
       </w:tblGrid>
       <w:tr>
         <w:trPr/>
@@ -18323,8 +18323,8 @@
         <w:jc w:val="center"/>
       </w:tblPr>
       <w:tblGrid>
-        <w:gridCol w:w="4680"/>
-        <w:gridCol w:w="4680"/>
+        <w:gridCol w:w="3640"/>
+        <w:gridCol w:w="3640"/>
       </w:tblGrid>
       <w:tr>
         <w:trPr/>
@@ -18368,8 +18368,8 @@
         </w:tc>
       </w:tr>
       <w:tblGrid>
-        <w:gridCol w:w="4680"/>
-        <w:gridCol w:w="4680"/>
+        <w:gridCol w:w="3640"/>
+        <w:gridCol w:w="3640"/>
       </w:tblGrid>
       <w:tr>
         <w:trPr/>
@@ -20523,8 +20523,8 @@
         <w:jc w:val="center"/>
       </w:tblPr>
       <w:tblGrid>
-        <w:gridCol w:w="4680"/>
-        <w:gridCol w:w="4680"/>
+        <w:gridCol w:w="3640"/>
+        <w:gridCol w:w="3640"/>
       </w:tblGrid>
       <w:tr>
         <w:trPr/>
@@ -20568,8 +20568,8 @@
         </w:tc>
       </w:tr>
       <w:tblGrid>
-        <w:gridCol w:w="4680"/>
-        <w:gridCol w:w="4680"/>
+        <w:gridCol w:w="3640"/>
+        <w:gridCol w:w="3640"/>
       </w:tblGrid>
       <w:tr>
         <w:trPr/>
@@ -21237,8 +21237,8 @@
         <w:jc w:val="center"/>
       </w:tblPr>
       <w:tblGrid>
-        <w:gridCol w:w="4680"/>
-        <w:gridCol w:w="4680"/>
+        <w:gridCol w:w="3640"/>
+        <w:gridCol w:w="3640"/>
       </w:tblGrid>
       <w:tr>
         <w:trPr/>
@@ -21282,8 +21282,8 @@
         </w:tc>
       </w:tr>
       <w:tblGrid>
-        <w:gridCol w:w="4680"/>
-        <w:gridCol w:w="4680"/>
+        <w:gridCol w:w="3640"/>
+        <w:gridCol w:w="3640"/>
       </w:tblGrid>
       <w:tr>
         <w:trPr/>
@@ -21816,8 +21816,8 @@
         <w:jc w:val="center"/>
       </w:tblPr>
       <w:tblGrid>
-        <w:gridCol w:w="4680"/>
-        <w:gridCol w:w="4680"/>
+        <w:gridCol w:w="3640"/>
+        <w:gridCol w:w="3640"/>
       </w:tblGrid>
       <w:tr>
         <w:trPr/>
@@ -21861,8 +21861,8 @@
         </w:tc>
       </w:tr>
       <w:tblGrid>
-        <w:gridCol w:w="4680"/>
-        <w:gridCol w:w="4680"/>
+        <w:gridCol w:w="3640"/>
+        <w:gridCol w:w="3640"/>
       </w:tblGrid>
       <w:tr>
         <w:trPr/>
@@ -22330,8 +22330,8 @@
         <w:jc w:val="center"/>
       </w:tblPr>
       <w:tblGrid>
-        <w:gridCol w:w="4680"/>
-        <w:gridCol w:w="4680"/>
+        <w:gridCol w:w="3640"/>
+        <w:gridCol w:w="3640"/>
       </w:tblGrid>
       <w:tr>
         <w:trPr/>
@@ -22375,8 +22375,8 @@
         </w:tc>
       </w:tr>
       <w:tblGrid>
-        <w:gridCol w:w="4680"/>
-        <w:gridCol w:w="4680"/>
+        <w:gridCol w:w="3640"/>
+        <w:gridCol w:w="3640"/>
       </w:tblGrid>
       <w:tr>
         <w:trPr/>
@@ -23264,8 +23264,8 @@
         <w:jc w:val="center"/>
       </w:tblPr>
       <w:tblGrid>
-        <w:gridCol w:w="4680"/>
-        <w:gridCol w:w="4680"/>
+        <w:gridCol w:w="3640"/>
+        <w:gridCol w:w="3640"/>
       </w:tblGrid>
       <w:tr>
         <w:trPr/>
@@ -23309,8 +23309,8 @@
         </w:tc>
       </w:tr>
       <w:tblGrid>
-        <w:gridCol w:w="4680"/>
-        <w:gridCol w:w="4680"/>
+        <w:gridCol w:w="3640"/>
+        <w:gridCol w:w="3640"/>
       </w:tblGrid>
       <w:tr>
         <w:trPr/>
@@ -24454,8 +24454,8 @@
         <w:jc w:val="center"/>
       </w:tblPr>
       <w:tblGrid>
-        <w:gridCol w:w="4680"/>
-        <w:gridCol w:w="4680"/>
+        <w:gridCol w:w="3640"/>
+        <w:gridCol w:w="3640"/>
       </w:tblGrid>
       <w:tr>
         <w:trPr/>
@@ -24499,8 +24499,8 @@
         </w:tc>
       </w:tr>
       <w:tblGrid>
-        <w:gridCol w:w="4680"/>
-        <w:gridCol w:w="4680"/>
+        <w:gridCol w:w="3640"/>
+        <w:gridCol w:w="3640"/>
       </w:tblGrid>
       <w:tr>
         <w:trPr/>
@@ -24748,9 +24748,9 @@
         <w:jc w:val="center"/>
       </w:tblPr>
       <w:tblGrid>
-        <w:gridCol w:w="3120"/>
-        <w:gridCol w:w="3120"/>
-        <w:gridCol w:w="3120"/>
+        <w:gridCol w:w="2426.6666666666665"/>
+        <w:gridCol w:w="2426.6666666666665"/>
+        <w:gridCol w:w="2426.6666666666665"/>
       </w:tblGrid>
       <w:tr>
         <w:trPr/>
@@ -24813,9 +24813,9 @@
         </w:tc>
       </w:tr>
       <w:tblGrid>
-        <w:gridCol w:w="3120"/>
-        <w:gridCol w:w="3120"/>
-        <w:gridCol w:w="3120"/>
+        <w:gridCol w:w="2426.6666666666665"/>
+        <w:gridCol w:w="2426.6666666666665"/>
+        <w:gridCol w:w="2426.6666666666665"/>
       </w:tblGrid>
       <w:tr>
         <w:trPr/>
@@ -25685,8 +25685,8 @@
         <w:jc w:val="center"/>
       </w:tblPr>
       <w:tblGrid>
-        <w:gridCol w:w="4680"/>
-        <w:gridCol w:w="4680"/>
+        <w:gridCol w:w="3640"/>
+        <w:gridCol w:w="3640"/>
       </w:tblGrid>
       <w:tr>
         <w:trPr/>
@@ -25730,8 +25730,8 @@
         </w:tc>
       </w:tr>
       <w:tblGrid>
-        <w:gridCol w:w="4680"/>
-        <w:gridCol w:w="4680"/>
+        <w:gridCol w:w="3640"/>
+        <w:gridCol w:w="3640"/>
       </w:tblGrid>
       <w:tr>
         <w:trPr/>
@@ -26173,8 +26173,8 @@
         <w:jc w:val="center"/>
       </w:tblPr>
       <w:tblGrid>
-        <w:gridCol w:w="4680"/>
-        <w:gridCol w:w="4680"/>
+        <w:gridCol w:w="3640"/>
+        <w:gridCol w:w="3640"/>
       </w:tblGrid>
       <w:tr>
         <w:trPr/>
@@ -26218,8 +26218,8 @@
         </w:tc>
       </w:tr>
       <w:tblGrid>
-        <w:gridCol w:w="4680"/>
-        <w:gridCol w:w="4680"/>
+        <w:gridCol w:w="3640"/>
+        <w:gridCol w:w="3640"/>
       </w:tblGrid>
       <w:tr>
         <w:trPr/>
@@ -26727,14 +26727,14 @@
         <w:rPr/>
         <w:drawing>
           <wp:inline distB="0" distL="0" distR="0" distT="0">
-            <wp:extent cx="5943600" cy="5943600"/>
+            <wp:extent cx="4622800" cy="4622800"/>
             <wp:effectExtent b="0" l="0" r="0" t="0"/>
-            <wp:docPr id="1" name="image-Coz-S_4x9nWlBe0VM0Ob5.webp"/>
+            <wp:docPr id="1" name="image-ziIC5hj_bNZzAnMv5kzpB.webp"/>
             <a:graphic>
               <a:graphicData uri="http://schemas.openxmlformats.org/drawingml/2006/picture">
                 <pic:pic>
                   <pic:nvPicPr>
-                    <pic:cNvPr id="1" name="image-Coz-S_4x9nWlBe0VM0Ob5.webp" descr="Logo di Triad"/>
+                    <pic:cNvPr id="1" name="image-ziIC5hj_bNZzAnMv5kzpB.webp" descr="Logo di Triad"/>
                     <pic:cNvPicPr/>
                   </pic:nvPicPr>
                   <pic:blipFill>
@@ -26747,7 +26747,7 @@
                   <pic:spPr>
                     <a:xfrm>
                       <a:off x="0" y="0"/>
-                      <a:ext cx="5943600" cy="5943600"/>
+                      <a:ext cx="4622800" cy="4622800"/>
                     </a:xfrm>
                     <a:prstGeom prst="rect"/>
                   </pic:spPr>
@@ -27201,8 +27201,8 @@
         <w:jc w:val="center"/>
       </w:tblPr>
       <w:tblGrid>
-        <w:gridCol w:w="4680"/>
-        <w:gridCol w:w="4680"/>
+        <w:gridCol w:w="3640"/>
+        <w:gridCol w:w="3640"/>
       </w:tblGrid>
       <w:tr>
         <w:trPr/>
@@ -27246,8 +27246,8 @@
         </w:tc>
       </w:tr>
       <w:tblGrid>
-        <w:gridCol w:w="4680"/>
-        <w:gridCol w:w="4680"/>
+        <w:gridCol w:w="3640"/>
+        <w:gridCol w:w="3640"/>
       </w:tblGrid>
       <w:tr>
         <w:trPr/>
@@ -27646,8 +27646,8 @@
         <w:jc w:val="center"/>
       </w:tblPr>
       <w:tblGrid>
-        <w:gridCol w:w="4680"/>
-        <w:gridCol w:w="4680"/>
+        <w:gridCol w:w="3640"/>
+        <w:gridCol w:w="3640"/>
       </w:tblGrid>
       <w:tr>
         <w:trPr/>
@@ -27691,8 +27691,8 @@
         </w:tc>
       </w:tr>
       <w:tblGrid>
-        <w:gridCol w:w="4680"/>
-        <w:gridCol w:w="4680"/>
+        <w:gridCol w:w="3640"/>
+        <w:gridCol w:w="3640"/>
       </w:tblGrid>
       <w:tr>
         <w:trPr/>
@@ -28597,8 +28597,8 @@
         <w:jc w:val="center"/>
       </w:tblPr>
       <w:tblGrid>
-        <w:gridCol w:w="4680"/>
-        <w:gridCol w:w="4680"/>
+        <w:gridCol w:w="3640"/>
+        <w:gridCol w:w="3640"/>
       </w:tblGrid>
       <w:tr>
         <w:trPr/>
@@ -28642,8 +28642,8 @@
         </w:tc>
       </w:tr>
       <w:tblGrid>
-        <w:gridCol w:w="4680"/>
-        <w:gridCol w:w="4680"/>
+        <w:gridCol w:w="3640"/>
+        <w:gridCol w:w="3640"/>
       </w:tblGrid>
       <w:tr>
         <w:trPr/>
@@ -29045,8 +29045,8 @@
         <w:jc w:val="center"/>
       </w:tblPr>
       <w:tblGrid>
-        <w:gridCol w:w="4680"/>
-        <w:gridCol w:w="4680"/>
+        <w:gridCol w:w="3640"/>
+        <w:gridCol w:w="3640"/>
       </w:tblGrid>
       <w:tr>
         <w:trPr/>
@@ -29090,8 +29090,8 @@
         </w:tc>
       </w:tr>
       <w:tblGrid>
-        <w:gridCol w:w="4680"/>
-        <w:gridCol w:w="4680"/>
+        <w:gridCol w:w="3640"/>
+        <w:gridCol w:w="3640"/>
       </w:tblGrid>
       <w:tr>
         <w:trPr/>
@@ -29862,9 +29862,9 @@
         <w:jc w:val="center"/>
       </w:tblPr>
       <w:tblGrid>
-        <w:gridCol w:w="3120"/>
-        <w:gridCol w:w="3120"/>
-        <w:gridCol w:w="3120"/>
+        <w:gridCol w:w="2426.6666666666665"/>
+        <w:gridCol w:w="2426.6666666666665"/>
+        <w:gridCol w:w="2426.6666666666665"/>
       </w:tblGrid>
       <w:tr>
         <w:trPr/>
@@ -29927,9 +29927,9 @@
         </w:tc>
       </w:tr>
       <w:tblGrid>
-        <w:gridCol w:w="3120"/>
-        <w:gridCol w:w="3120"/>
-        <w:gridCol w:w="3120"/>
+        <w:gridCol w:w="2426.6666666666665"/>
+        <w:gridCol w:w="2426.6666666666665"/>
+        <w:gridCol w:w="2426.6666666666665"/>
       </w:tblGrid>
       <w:tr>
         <w:trPr/>
@@ -30955,9 +30955,9 @@
         <w:jc w:val="center"/>
       </w:tblPr>
       <w:tblGrid>
-        <w:gridCol w:w="3120"/>
-        <w:gridCol w:w="3120"/>
-        <w:gridCol w:w="3120"/>
+        <w:gridCol w:w="2426.6666666666665"/>
+        <w:gridCol w:w="2426.6666666666665"/>
+        <w:gridCol w:w="2426.6666666666665"/>
       </w:tblGrid>
       <w:tr>
         <w:trPr/>
@@ -31022,9 +31022,9 @@
         </w:tc>
       </w:tr>
       <w:tblGrid>
-        <w:gridCol w:w="3120"/>
-        <w:gridCol w:w="3120"/>
-        <w:gridCol w:w="3120"/>
+        <w:gridCol w:w="2426.6666666666665"/>
+        <w:gridCol w:w="2426.6666666666665"/>
+        <w:gridCol w:w="2426.6666666666665"/>
       </w:tblGrid>
       <w:tr>
         <w:trPr/>
@@ -32154,9 +32154,9 @@
         <w:jc w:val="center"/>
       </w:tblPr>
       <w:tblGrid>
-        <w:gridCol w:w="3120"/>
-        <w:gridCol w:w="3120"/>
-        <w:gridCol w:w="3120"/>
+        <w:gridCol w:w="2426.6666666666665"/>
+        <w:gridCol w:w="2426.6666666666665"/>
+        <w:gridCol w:w="2426.6666666666665"/>
       </w:tblGrid>
       <w:tr>
         <w:trPr/>
@@ -32219,9 +32219,9 @@
         </w:tc>
       </w:tr>
       <w:tblGrid>
-        <w:gridCol w:w="3120"/>
-        <w:gridCol w:w="3120"/>
-        <w:gridCol w:w="3120"/>
+        <w:gridCol w:w="2426.6666666666665"/>
+        <w:gridCol w:w="2426.6666666666665"/>
+        <w:gridCol w:w="2426.6666666666665"/>
       </w:tblGrid>
       <w:tr>
         <w:trPr/>
@@ -34976,8 +34976,8 @@
         <w:jc w:val="center"/>
       </w:tblPr>
       <w:tblGrid>
-        <w:gridCol w:w="4680"/>
-        <w:gridCol w:w="4680"/>
+        <w:gridCol w:w="3640"/>
+        <w:gridCol w:w="3640"/>
       </w:tblGrid>
       <w:tr>
         <w:trPr/>
@@ -35021,8 +35021,8 @@
         </w:tc>
       </w:tr>
       <w:tblGrid>
-        <w:gridCol w:w="4680"/>
-        <w:gridCol w:w="4680"/>
+        <w:gridCol w:w="3640"/>
+        <w:gridCol w:w="3640"/>
       </w:tblGrid>
       <w:tr>
         <w:trPr/>
@@ -35582,8 +35582,8 @@
         <w:jc w:val="center"/>
       </w:tblPr>
       <w:tblGrid>
-        <w:gridCol w:w="4680"/>
-        <w:gridCol w:w="4680"/>
+        <w:gridCol w:w="3640"/>
+        <w:gridCol w:w="3640"/>
       </w:tblGrid>
       <w:tr>
         <w:trPr/>
@@ -35627,8 +35627,8 @@
         </w:tc>
       </w:tr>
       <w:tblGrid>
-        <w:gridCol w:w="4680"/>
-        <w:gridCol w:w="4680"/>
+        <w:gridCol w:w="3640"/>
+        <w:gridCol w:w="3640"/>
       </w:tblGrid>
       <w:tr>
         <w:trPr/>
@@ -36148,8 +36148,8 @@
         <w:jc w:val="center"/>
       </w:tblPr>
       <w:tblGrid>
-        <w:gridCol w:w="4680"/>
-        <w:gridCol w:w="4680"/>
+        <w:gridCol w:w="3640"/>
+        <w:gridCol w:w="3640"/>
       </w:tblGrid>
       <w:tr>
         <w:trPr/>
@@ -36193,8 +36193,8 @@
         </w:tc>
       </w:tr>
       <w:tblGrid>
-        <w:gridCol w:w="4680"/>
-        <w:gridCol w:w="4680"/>
+        <w:gridCol w:w="3640"/>
+        <w:gridCol w:w="3640"/>
       </w:tblGrid>
       <w:tr>
         <w:trPr/>
@@ -37192,9 +37192,9 @@
         <w:jc w:val="center"/>
       </w:tblPr>
       <w:tblGrid>
-        <w:gridCol w:w="3120"/>
-        <w:gridCol w:w="3120"/>
-        <w:gridCol w:w="3120"/>
+        <w:gridCol w:w="2426.6666666666665"/>
+        <w:gridCol w:w="2426.6666666666665"/>
+        <w:gridCol w:w="2426.6666666666665"/>
       </w:tblGrid>
       <w:tr>
         <w:trPr/>
@@ -37297,9 +37297,9 @@
         </w:tc>
       </w:tr>
       <w:tblGrid>
-        <w:gridCol w:w="3120"/>
-        <w:gridCol w:w="3120"/>
-        <w:gridCol w:w="3120"/>
+        <w:gridCol w:w="2426.6666666666665"/>
+        <w:gridCol w:w="2426.6666666666665"/>
+        <w:gridCol w:w="2426.6666666666665"/>
       </w:tblGrid>
       <w:tr>
         <w:trPr/>
@@ -39988,9 +39988,9 @@
         <w:jc w:val="center"/>
       </w:tblPr>
       <w:tblGrid>
-        <w:gridCol w:w="3120"/>
-        <w:gridCol w:w="3120"/>
-        <w:gridCol w:w="3120"/>
+        <w:gridCol w:w="2426.6666666666665"/>
+        <w:gridCol w:w="2426.6666666666665"/>
+        <w:gridCol w:w="2426.6666666666665"/>
       </w:tblGrid>
       <w:tr>
         <w:trPr/>
@@ -40053,9 +40053,9 @@
         </w:tc>
       </w:tr>
       <w:tblGrid>
-        <w:gridCol w:w="3120"/>
-        <w:gridCol w:w="3120"/>
-        <w:gridCol w:w="3120"/>
+        <w:gridCol w:w="2426.6666666666665"/>
+        <w:gridCol w:w="2426.6666666666665"/>
+        <w:gridCol w:w="2426.6666666666665"/>
       </w:tblGrid>
       <w:tr>
         <w:trPr/>
@@ -40917,8 +40917,8 @@
         <w:jc w:val="center"/>
       </w:tblPr>
       <w:tblGrid>
-        <w:gridCol w:w="4680"/>
-        <w:gridCol w:w="4680"/>
+        <w:gridCol w:w="3640"/>
+        <w:gridCol w:w="3640"/>
       </w:tblGrid>
       <w:tr>
         <w:trPr/>
@@ -40962,8 +40962,8 @@
         </w:tc>
       </w:tr>
       <w:tblGrid>
-        <w:gridCol w:w="4680"/>
-        <w:gridCol w:w="4680"/>
+        <w:gridCol w:w="3640"/>
+        <w:gridCol w:w="3640"/>
       </w:tblGrid>
       <w:tr>
         <w:trPr/>
@@ -43275,8 +43275,8 @@
         <w:jc w:val="center"/>
       </w:tblPr>
       <w:tblGrid>
-        <w:gridCol w:w="4680"/>
-        <w:gridCol w:w="4680"/>
+        <w:gridCol w:w="3640"/>
+        <w:gridCol w:w="3640"/>
       </w:tblGrid>
       <w:tr>
         <w:trPr/>
@@ -43320,8 +43320,8 @@
         </w:tc>
       </w:tr>
       <w:tblGrid>
-        <w:gridCol w:w="4680"/>
-        <w:gridCol w:w="4680"/>
+        <w:gridCol w:w="3640"/>
+        <w:gridCol w:w="3640"/>
       </w:tblGrid>
       <w:tr>
         <w:trPr/>
@@ -44822,8 +44822,8 @@
         <w:jc w:val="center"/>
       </w:tblPr>
       <w:tblGrid>
-        <w:gridCol w:w="4680"/>
-        <w:gridCol w:w="4680"/>
+        <w:gridCol w:w="3640"/>
+        <w:gridCol w:w="3640"/>
       </w:tblGrid>
       <w:tr>
         <w:trPr/>
@@ -44867,8 +44867,8 @@
         </w:tc>
       </w:tr>
       <w:tblGrid>
-        <w:gridCol w:w="4680"/>
-        <w:gridCol w:w="4680"/>
+        <w:gridCol w:w="3640"/>
+        <w:gridCol w:w="3640"/>
       </w:tblGrid>
       <w:tr>
         <w:trPr/>
@@ -45875,9 +45875,9 @@
         <w:jc w:val="center"/>
       </w:tblPr>
       <w:tblGrid>
-        <w:gridCol w:w="3120"/>
-        <w:gridCol w:w="3120"/>
-        <w:gridCol w:w="3120"/>
+        <w:gridCol w:w="2426.6666666666665"/>
+        <w:gridCol w:w="2426.6666666666665"/>
+        <w:gridCol w:w="2426.6666666666665"/>
       </w:tblGrid>
       <w:tr>
         <w:trPr/>
@@ -45940,9 +45940,9 @@
         </w:tc>
       </w:tr>
       <w:tblGrid>
-        <w:gridCol w:w="3120"/>
-        <w:gridCol w:w="3120"/>
-        <w:gridCol w:w="3120"/>
+        <w:gridCol w:w="2426.6666666666665"/>
+        <w:gridCol w:w="2426.6666666666665"/>
+        <w:gridCol w:w="2426.6666666666665"/>
       </w:tblGrid>
       <w:tr>
         <w:trPr/>
@@ -46689,9 +46689,9 @@
         <w:jc w:val="center"/>
       </w:tblPr>
       <w:tblGrid>
-        <w:gridCol w:w="3120"/>
-        <w:gridCol w:w="3120"/>
-        <w:gridCol w:w="3120"/>
+        <w:gridCol w:w="2426.6666666666665"/>
+        <w:gridCol w:w="2426.6666666666665"/>
+        <w:gridCol w:w="2426.6666666666665"/>
       </w:tblGrid>
       <w:tr>
         <w:trPr/>
@@ -46754,9 +46754,9 @@
         </w:tc>
       </w:tr>
       <w:tblGrid>
-        <w:gridCol w:w="3120"/>
-        <w:gridCol w:w="3120"/>
-        <w:gridCol w:w="3120"/>
+        <w:gridCol w:w="2426.6666666666665"/>
+        <w:gridCol w:w="2426.6666666666665"/>
+        <w:gridCol w:w="2426.6666666666665"/>
       </w:tblGrid>
       <w:tr>
         <w:trPr/>
@@ -49750,8 +49750,8 @@
         <w:jc w:val="center"/>
       </w:tblPr>
       <w:tblGrid>
-        <w:gridCol w:w="4680"/>
-        <w:gridCol w:w="4680"/>
+        <w:gridCol w:w="3640"/>
+        <w:gridCol w:w="3640"/>
       </w:tblGrid>
       <w:tr>
         <w:trPr/>
@@ -49795,8 +49795,8 @@
         </w:tc>
       </w:tr>
       <w:tblGrid>
-        <w:gridCol w:w="4680"/>
-        <w:gridCol w:w="4680"/>
+        <w:gridCol w:w="3640"/>
+        <w:gridCol w:w="3640"/>
       </w:tblGrid>
       <w:tr>
         <w:trPr/>
@@ -50309,8 +50309,8 @@
         <w:jc w:val="center"/>
       </w:tblPr>
       <w:tblGrid>
-        <w:gridCol w:w="4680"/>
-        <w:gridCol w:w="4680"/>
+        <w:gridCol w:w="3640"/>
+        <w:gridCol w:w="3640"/>
       </w:tblGrid>
       <w:tr>
         <w:trPr/>
@@ -50354,8 +50354,8 @@
         </w:tc>
       </w:tr>
       <w:tblGrid>
-        <w:gridCol w:w="4680"/>
-        <w:gridCol w:w="4680"/>
+        <w:gridCol w:w="3640"/>
+        <w:gridCol w:w="3640"/>
       </w:tblGrid>
       <w:tr>
         <w:trPr/>
@@ -51560,8 +51560,8 @@
         <w:jc w:val="center"/>
       </w:tblPr>
       <w:tblGrid>
-        <w:gridCol w:w="4680"/>
-        <w:gridCol w:w="4680"/>
+        <w:gridCol w:w="3640"/>
+        <w:gridCol w:w="3640"/>
       </w:tblGrid>
       <w:tr>
         <w:trPr/>
@@ -51605,8 +51605,8 @@
         </w:tc>
       </w:tr>
       <w:tblGrid>
-        <w:gridCol w:w="4680"/>
-        <w:gridCol w:w="4680"/>
+        <w:gridCol w:w="3640"/>
+        <w:gridCol w:w="3640"/>
       </w:tblGrid>
       <w:tr>
         <w:trPr/>
@@ -52906,8 +52906,8 @@
         <w:jc w:val="center"/>
       </w:tblPr>
       <w:tblGrid>
-        <w:gridCol w:w="4680"/>
-        <w:gridCol w:w="4680"/>
+        <w:gridCol w:w="3640"/>
+        <w:gridCol w:w="3640"/>
       </w:tblGrid>
       <w:tr>
         <w:trPr/>
@@ -52951,8 +52951,8 @@
         </w:tc>
       </w:tr>
       <w:tblGrid>
-        <w:gridCol w:w="4680"/>
-        <w:gridCol w:w="4680"/>
+        <w:gridCol w:w="3640"/>
+        <w:gridCol w:w="3640"/>
       </w:tblGrid>
       <w:tr>
         <w:trPr/>
@@ -54268,8 +54268,8 @@
         <w:jc w:val="center"/>
       </w:tblPr>
       <w:tblGrid>
-        <w:gridCol w:w="4680"/>
-        <w:gridCol w:w="4680"/>
+        <w:gridCol w:w="3640"/>
+        <w:gridCol w:w="3640"/>
       </w:tblGrid>
       <w:tr>
         <w:trPr/>
@@ -54313,8 +54313,8 @@
         </w:tc>
       </w:tr>
       <w:tblGrid>
-        <w:gridCol w:w="4680"/>
-        <w:gridCol w:w="4680"/>
+        <w:gridCol w:w="3640"/>
+        <w:gridCol w:w="3640"/>
       </w:tblGrid>
       <w:tr>
         <w:trPr/>
@@ -54690,8 +54690,8 @@
         <w:jc w:val="center"/>
       </w:tblPr>
       <w:tblGrid>
-        <w:gridCol w:w="4680"/>
-        <w:gridCol w:w="4680"/>
+        <w:gridCol w:w="3640"/>
+        <w:gridCol w:w="3640"/>
       </w:tblGrid>
       <w:tr>
         <w:trPr/>
@@ -54735,8 +54735,8 @@
         </w:tc>
       </w:tr>
       <w:tblGrid>
-        <w:gridCol w:w="4680"/>
-        <w:gridCol w:w="4680"/>
+        <w:gridCol w:w="3640"/>
+        <w:gridCol w:w="3640"/>
       </w:tblGrid>
       <w:tr>
         <w:trPr/>
@@ -55505,9 +55505,9 @@
         <w:jc w:val="center"/>
       </w:tblPr>
       <w:tblGrid>
-        <w:gridCol w:w="3120"/>
-        <w:gridCol w:w="3120"/>
-        <w:gridCol w:w="3120"/>
+        <w:gridCol w:w="2426.6666666666665"/>
+        <w:gridCol w:w="2426.6666666666665"/>
+        <w:gridCol w:w="2426.6666666666665"/>
       </w:tblGrid>
       <w:tr>
         <w:trPr/>
@@ -55570,9 +55570,9 @@
         </w:tc>
       </w:tr>
       <w:tblGrid>
-        <w:gridCol w:w="3120"/>
-        <w:gridCol w:w="3120"/>
-        <w:gridCol w:w="3120"/>
+        <w:gridCol w:w="2426.6666666666665"/>
+        <w:gridCol w:w="2426.6666666666665"/>
+        <w:gridCol w:w="2426.6666666666665"/>
       </w:tblGrid>
       <w:tr>
         <w:trPr/>
@@ -56380,9 +56380,9 @@
         <w:jc w:val="center"/>
       </w:tblPr>
       <w:tblGrid>
-        <w:gridCol w:w="3120"/>
-        <w:gridCol w:w="3120"/>
-        <w:gridCol w:w="3120"/>
+        <w:gridCol w:w="2426.6666666666665"/>
+        <w:gridCol w:w="2426.6666666666665"/>
+        <w:gridCol w:w="2426.6666666666665"/>
       </w:tblGrid>
       <w:tr>
         <w:trPr/>
@@ -56445,9 +56445,9 @@
         </w:tc>
       </w:tr>
       <w:tblGrid>
-        <w:gridCol w:w="3120"/>
-        <w:gridCol w:w="3120"/>
-        <w:gridCol w:w="3120"/>
+        <w:gridCol w:w="2426.6666666666665"/>
+        <w:gridCol w:w="2426.6666666666665"/>
+        <w:gridCol w:w="2426.6666666666665"/>
       </w:tblGrid>
       <w:tr>
         <w:trPr/>
@@ -57979,9 +57979,9 @@
         <w:jc w:val="center"/>
       </w:tblPr>
       <w:tblGrid>
-        <w:gridCol w:w="3120"/>
-        <w:gridCol w:w="3120"/>
-        <w:gridCol w:w="3120"/>
+        <w:gridCol w:w="2426.6666666666665"/>
+        <w:gridCol w:w="2426.6666666666665"/>
+        <w:gridCol w:w="2426.6666666666665"/>
       </w:tblGrid>
       <w:tr>
         <w:trPr/>
@@ -58044,9 +58044,9 @@
         </w:tc>
       </w:tr>
       <w:tblGrid>
-        <w:gridCol w:w="3120"/>
-        <w:gridCol w:w="3120"/>
-        <w:gridCol w:w="3120"/>
+        <w:gridCol w:w="2426.6666666666665"/>
+        <w:gridCol w:w="2426.6666666666665"/>
+        <w:gridCol w:w="2426.6666666666665"/>
       </w:tblGrid>
       <w:tr>
         <w:trPr/>

</xml_diff>

<commit_message>
docs(libro): ripristino build-libro (senza PRATICA), rigenerazione completa + EPUB/MOBI
</commit_message>
<xml_diff>
--- a/docs/libro/libro.docx
+++ b/docs/libro/libro.docx
@@ -5,6 +5,8 @@
     <w:sectPr>
       <w:pgSz w:w="8640" w:h="12960" w:orient="portrait"/>
       <w:pgMar w:top="850" w:right="680" w:bottom="850" w:left="680" w:header="undefined" w:footer="undefined" w:gutter="undefined"/>
+      <w:footerReference r:id="rId153" w:type="default"/>
+      <w:titlePg/>
     </w:sectPr>
     <w:p>
       <w:pPr>
@@ -58,7 +60,7 @@
       </w:pPr>
       <w:r>
         <w:rPr/>
-        <w:t xml:space="preserve">Il volume è organizzato in quattro parti. La prima, </w:t>
+        <w:t xml:space="preserve">Il volume è organizzato in cinque parti. La prima, </w:t>
       </w:r>
       <w:r>
         <w:rPr/>
@@ -90,7 +92,40 @@
       </w:r>
       <w:r>
         <w:rPr/>
-        <w:t xml:space="preserve">, accompagna il lettore nel codice del repository: il seed in codice macchina, la suite di conformance, la CLI, gli strumenti per gli editor.</w:t>
+        <w:t xml:space="preserve">, accompagna il lettore nel codice del repository: il seed in codice macchina, la suite di conformance, la CLI, gli strumenti per gli editor. La quinta, </w:t>
+      </w:r>
+      <w:r>
+        <w:rPr/>
+        <w:t xml:space="preserve">Sul campo</w:t>
+      </w:r>
+      <w:r>
+        <w:rPr/>
+        <w:t xml:space="preserve">, affronta il lavoro quotidiano: scegliere il costrutto giusto per ogni problema, portare un programma esistente a Triad, verificare il codice con sonde, golden e benchmark, proporre una modifica al linguaggio.</w:t>
+      </w:r>
+    </w:p>
+    <w:p>
+      <w:pPr>
+        <w:spacing w:lineRule="auto"/>
+      </w:pPr>
+      <w:r>
+        <w:rPr/>
+        <w:t xml:space="preserve">In coda al volume, l'appendice riporta per intero i due testi normativi, </w:t>
+      </w:r>
+      <w:r>
+        <w:rPr/>
+        <w:t xml:space="preserve">SPEC.md</w:t>
+      </w:r>
+      <w:r>
+        <w:rPr/>
+        <w:t xml:space="preserve"> e </w:t>
+      </w:r>
+      <w:r>
+        <w:rPr/>
+        <w:t xml:space="preserve">SPEC-CORE.md</w:t>
+      </w:r>
+      <w:r>
+        <w:rPr/>
+        <w:t xml:space="preserve">. Il volume è così autosufficiente: ogni affermazione del manuale può essere controllata sulla fonte che la definisce.</w:t>
       </w:r>
     </w:p>
     <w:p>
@@ -167,11 +202,12 @@
     </w:p>
     <w:p>
       <w:pPr>
-        <w:spacing w:lineRule="auto"/>
-      </w:pPr>
-      <w:r>
-        <w:rPr/>
-        <w:t xml:space="preserve">﻿# Manuale di Triad 2.0</w:t>
+        <w:pStyle w:val="Heading1"/>
+        <w:spacing w:lineRule="auto"/>
+      </w:pPr>
+      <w:r>
+        <w:rPr/>
+        <w:t xml:space="preserve">Manuale di Triad 2.0</w:t>
       </w:r>
     </w:p>
     <w:p>
@@ -191,7 +227,7 @@
       </w:pPr>
       <w:r>
         <w:rPr/>
-        <w:t xml:space="preserve">Triad Ã¨ un linguaggio di programmazione autonomo: sintassi a blocchi e tipi dichiarati, multiple dispatch, programmazione logica integrata e codice come dato, in una sola sintassi. La sua definizione Ã¨ una specifica normativa indipendente da qualsiasi implementazione (</w:t>
+        <w:t xml:space="preserve">Triad è un linguaggio di programmazione autonomo: sintassi a blocchi e tipi dichiarati, multiple dispatch, programmazione logica integrata e codice come dato, in una sola sintassi. La sua definizione è una specifica normativa indipendente da qualsiasi implementazione (</w:t>
       </w:r>
       <w:hyperlink r:id="rId6">
         <w:r>
@@ -223,7 +259,7 @@
       </w:hyperlink>
       <w:r>
         <w:rPr/>
-        <w:t xml:space="preserve">) e da una suite di conformitÃ  con golden verificabili (</w:t>
+        <w:t xml:space="preserve">) e da una suite di conformità con golden verificabili (</w:t>
       </w:r>
       <w:hyperlink r:id="rId8">
         <w:r>
@@ -244,7 +280,7 @@
       </w:pPr>
       <w:r>
         <w:rPr/>
-        <w:t xml:space="preserve">Questo manuale insegna il linguaggio per come Ã¨ definito dallo standard. Non Ã¨ un riassunto della specifica: Ã¨ un percorso di studio, con spiegazioni, esempi ed esercizi.</w:t>
+        <w:t xml:space="preserve">Questo manuale insegna il linguaggio per come è definito dallo standard. Non è un riassunto della specifica: è un percorso di studio, con spiegazioni, esempi ed esercizi.</w:t>
       </w:r>
     </w:p>
     <w:p>
@@ -264,7 +300,7 @@
       </w:pPr>
       <w:r>
         <w:rPr/>
-        <w:t xml:space="preserve">A chi Ã¨ indirizzato</w:t>
+        <w:t xml:space="preserve">A chi è indirizzato</w:t>
       </w:r>
     </w:p>
     <w:p>
@@ -302,7 +338,7 @@
       </w:pPr>
       <w:r>
         <w:rPr/>
-        <w:t xml:space="preserve">Lo standard definisce due profili di conformitÃ , ed Ã¨ utile saperli distinguere prima di cominciare:</w:t>
+        <w:t xml:space="preserve">Lo standard definisce due profili di conformità, ed è utile saperli distinguere prima di cominciare:</w:t>
       </w:r>
     </w:p>
     <w:tbl>
@@ -382,7 +418,7 @@
             </w:pPr>
             <w:r>
               <w:rPr/>
-              <w:t xml:space="preserve">dove Ã¨ definito</w:t>
+              <w:t xml:space="preserve">dove è definito</w:t>
             </w:r>
           </w:p>
         </w:tc>
@@ -539,7 +575,7 @@
       </w:pPr>
       <w:r>
         <w:rPr/>
-        <w:t xml:space="preserve">Triad-Core Ã¨ un </w:t>
+        <w:t xml:space="preserve">Triad-Core è un </w:t>
       </w:r>
       <w:r>
         <w:rPr>
@@ -549,7 +585,7 @@
       </w:r>
       <w:r>
         <w:rPr/>
-        <w:t xml:space="preserve"> di Triad-Full: ogni programma Core Ã¨ anche un programma Full valido e deve comportarsi allo stesso modo. Il manuale presenta i due profili </w:t>
+        <w:t xml:space="preserve"> di Triad-Full: ogni programma Core è anche un programma Full valido e deve comportarsi allo stesso modo. Il manuale presenta i due profili </w:t>
       </w:r>
       <w:r>
         <w:rPr>
@@ -559,7 +595,7 @@
       </w:r>
       <w:r>
         <w:rPr/>
-        <w:t xml:space="preserve">, per costruzione logica: ogni capitolo introduce un costrutto e dice in quale profilo esiste. Non perchÃ© Full sia "piÃ¹ avanti", ma perchÃ© sono due facce della stessa specifica.</w:t>
+        <w:t xml:space="preserve">, per costruzione logica: ogni capitolo introduce un costrutto e dice in quale profilo esiste. Non perché Full sia "più avanti", ma perché sono due facce della stessa specifica.</w:t>
       </w:r>
     </w:p>
     <w:p>
@@ -587,7 +623,7 @@
       </w:r>
       <w:r>
         <w:rPr/>
-        <w:t xml:space="preserve"> â€” il costrutto esiste nel sottoinsieme di bootstrap;</w:t>
+        <w:t xml:space="preserve"> — il costrutto esiste nel sottoinsieme di bootstrap;</w:t>
       </w:r>
     </w:p>
     <w:p>
@@ -606,7 +642,7 @@
       </w:r>
       <w:r>
         <w:rPr/>
-        <w:t xml:space="preserve"> â€” il costrutto esiste solo nello standard completo.</w:t>
+        <w:t xml:space="preserve"> — il costrutto esiste solo nello standard completo.</w:t>
       </w:r>
     </w:p>
     <w:p>
@@ -853,7 +889,7 @@
               <w:rPr>
                 <w:highlight w:val="lightGray"/>
               </w:rPr>
-              <w:t xml:space="preserve">SPEC Â§n</w:t>
+              <w:t xml:space="preserve">SPEC §n</w:t>
             </w:r>
           </w:p>
         </w:tc>
@@ -892,7 +928,7 @@
       </w:pPr>
       <w:r>
         <w:rPr/>
-        <w:t xml:space="preserve">I blocchi di codice sono marcati con il loro livello di eseguibilitÃ :</w:t>
+        <w:t xml:space="preserve">I blocchi di codice sono marcati con il loro livello di eseguibilità:</w:t>
       </w:r>
     </w:p>
     <w:tbl>
@@ -1222,7 +1258,7 @@
       </w:pPr>
       <w:r>
         <w:rPr/>
-        <w:t xml:space="preserve">Parte I â€” Il linguaggio</w:t>
+        <w:t xml:space="preserve">Parte I — Il linguaggio</w:t>
       </w:r>
     </w:p>
     <w:p>
@@ -1287,7 +1323,7 @@
       </w:r>
       <w:r>
         <w:rPr/>
-        <w:t xml:space="preserve"> finale Ã¨ ammesso se non Ã¨ seguito da </w:t>
+        <w:t xml:space="preserve"> finale è ammesso se non è seguito da </w:t>
       </w:r>
       <w:r>
         <w:rPr/>
@@ -1341,7 +1377,7 @@
       </w:r>
       <w:r>
         <w:rPr/>
-        <w:t xml:space="preserve"> finale Ã¨ per le funzioni che mutano il loro argomento (cap. 9).</w:t>
+        <w:t xml:space="preserve"> finale è per le funzioni che mutano il loro argomento (cap. 9).</w:t>
       </w:r>
     </w:p>
     <w:p>
@@ -1367,7 +1403,7 @@
         <w:rPr>
           <w:rFonts w:ascii="Courier" w:hAnsi="Courier"/>
         </w:rPr>
-        <w:t xml:space="preserve">etÃ  = 42 </w:t>
+        <w:t xml:space="preserve">età = 42 </w:t>
       </w:r>
     </w:p>
     <w:p>
@@ -1394,7 +1430,7 @@
       </w:r>
       <w:r>
         <w:rPr/>
-        <w:t xml:space="preserve"> funziona come separatore. Il segno Ã¨ un operatore unario, non parte del letterale. </w:t>
+        <w:t xml:space="preserve"> funziona come separatore. Il segno è un operatore unario, non parte del letterale. </w:t>
       </w:r>
       <w:r>
         <w:rPr>
@@ -1482,7 +1518,7 @@
       </w:pPr>
       <w:r>
         <w:rPr/>
-        <w:t xml:space="preserve">Una stringa Ã¨ una sequenza di byte UTF-8 </w:t>
+        <w:t xml:space="preserve">Una stringa è una sequenza di byte UTF-8 </w:t>
       </w:r>
       <w:r>
         <w:rPr>
@@ -1650,7 +1686,7 @@
       </w:pPr>
       <w:r>
         <w:rPr/>
-        <w:t xml:space="preserve">Un simbolo Ã¨ </w:t>
+        <w:t xml:space="preserve">Un simbolo è </w:t>
       </w:r>
       <w:r>
         <w:rPr/>
@@ -1674,7 +1710,7 @@
       </w:r>
       <w:r>
         <w:rPr/>
-        <w:t xml:space="preserve">. Due simboli sono uguali se hanno lo stesso nome. In Triad-Full il simbolo Ã¨ anche l'atomo della logica (cap. 16). </w:t>
+        <w:t xml:space="preserve">. Due simboli sono uguali se hanno lo stesso nome. In Triad-Full il simbolo è anche l'atomo della logica (cap. 16). </w:t>
       </w:r>
       <w:r>
         <w:rPr>
@@ -1740,11 +1776,11 @@
       </w:r>
       <w:r>
         <w:rPr/>
-        <w:t xml:space="preserve">#= â€¦ =#</w:t>
-      </w:r>
-      <w:r>
-        <w:rPr/>
-        <w:t xml:space="preserve"> commenta su piÃ¹ righe; in Triad-Full i commenti annidati sono ammessi. </w:t>
+        <w:t xml:space="preserve">#= … =#</w:t>
+      </w:r>
+      <w:r>
+        <w:rPr/>
+        <w:t xml:space="preserve"> commenta su più righe; in Triad-Full i commenti annidati sono ammessi. </w:t>
       </w:r>
       <w:r>
         <w:rPr>
@@ -1761,7 +1797,7 @@
         <w:rPr>
           <w:rFonts w:ascii="Courier" w:hAnsi="Courier"/>
         </w:rPr>
-        <w:t xml:space="preserve">#= commento    su piÃ¹ righe =# x = 1_000   # commento di riga println(x) </w:t>
+        <w:t xml:space="preserve">#= commento    su più righe =# x = 1_000   # commento di riga println(x) </w:t>
       </w:r>
     </w:p>
     <w:p>
@@ -1882,7 +1918,7 @@
       </w:r>
       <w:r>
         <w:rPr/>
-        <w:t xml:space="preserve">. La grammatica di Core non ha una regola di continuazione di riga: un'espressione spezzata su piÃ¹ righe non Ã¨ un programma valido. Scrivi </w:t>
+        <w:t xml:space="preserve">. La grammatica di Core non ha una regola di continuazione di riga: un'espressione spezzata su più righe non è un programma valido. Scrivi </w:t>
       </w:r>
       <w:r>
         <w:rPr>
@@ -1950,11 +1986,11 @@
       </w:r>
       <w:r>
         <w:rPr/>
-        <w:t xml:space="preserve"> la regola Ã¨ piÃ¹ permissiva: </w:t>
-      </w:r>
-      <w:r>
-        <w:rPr/>
-        <w:t xml:space="preserve">SPEC Â§1</w:t>
+        <w:t xml:space="preserve"> la regola è più permissiva: </w:t>
+      </w:r>
+      <w:r>
+        <w:rPr/>
+        <w:t xml:space="preserve">SPEC §1</w:t>
       </w:r>
       <w:r>
         <w:rPr/>
@@ -1992,7 +2028,7 @@
       </w:r>
       <w:r>
         <w:rPr/>
-        <w:t xml:space="preserve">, nÃ© subito dopo un operatore binario. L'interprete di riferimento attuale non implementa ancora questa eccezione, quindi anche in Full la forma sicura resta una istruzione per riga.</w:t>
+        <w:t xml:space="preserve">, né subito dopo un operatore binario. L'interprete di riferimento attuale non implementa ancora questa eccezione, quindi anche in Full la forma sicura resta una istruzione per riga.</w:t>
       </w:r>
     </w:p>
     <w:p>
@@ -2023,7 +2059,7 @@
       </w:r>
       <w:r>
         <w:rPr/>
-        <w:t xml:space="preserve"> ne ha due. La specifica li chiama esplicitamente Â«il problema classico di </w:t>
+        <w:t xml:space="preserve"> ne ha due. La specifica li chiama esplicitamente «il problema classico di </w:t>
       </w:r>
       <w:r>
         <w:rPr/>
@@ -2031,7 +2067,7 @@
       </w:r>
       <w:r>
         <w:rPr/>
-        <w:t xml:space="preserve">Â» â€” Ã¨ il primo punto in cui Triad si discosta dalla sintassi che conosci.</w:t>
+        <w:t xml:space="preserve">» — è il primo punto in cui Triad si discosta dalla sintassi che conosci.</w:t>
       </w:r>
     </w:p>
     <w:tbl>
@@ -2169,7 +2205,7 @@
             </w:pPr>
             <w:r>
               <w:rPr/>
-              <w:t xml:space="preserve"> attaccato a un valore e senza spazi â†’ </w:t>
+              <w:t xml:space="preserve"> attaccato a un valore e senza spazi → </w:t>
             </w:r>
           </w:p>
           <w:p>
@@ -2254,7 +2290,7 @@
             </w:pPr>
             <w:r>
               <w:rPr/>
-              <w:t xml:space="preserve"> non preceduto da un valore e seguito da un nome â†’ </w:t>
+              <w:t xml:space="preserve"> non preceduto da un valore e seguito da un nome → </w:t>
             </w:r>
           </w:p>
           <w:p>
@@ -2289,26 +2325,26 @@
               <w:rPr>
                 <w:highlight w:val="lightGray"/>
               </w:rPr>
-              <w:t xml:space="preserve">:( â€¦ )</w:t>
-            </w:r>
-          </w:p>
-        </w:tc>
-        <w:tc>
-          <w:tcPr>
-            <w:tcBorders>
-              <w:top w:val="single" w:sz="1" w:space="0" w:color="000000"/>
-              <w:bottom w:val="single" w:sz="1" w:space="0" w:color="000000"/>
-              <w:left w:val="single" w:sz="1" w:space="0" w:color="000000"/>
-              <w:right w:val="single" w:sz="1" w:space="0" w:color="000000"/>
-            </w:tcBorders>
-          </w:tcPr>
-          <w:p>
-            <w:pPr>
-              <w:spacing w:lineRule="auto"/>
-            </w:pPr>
-            <w:r>
-              <w:rPr/>
-              <w:t xml:space="preserve">â†’ </w:t>
+              <w:t xml:space="preserve">:( … )</w:t>
+            </w:r>
+          </w:p>
+        </w:tc>
+        <w:tc>
+          <w:tcPr>
+            <w:tcBorders>
+              <w:top w:val="single" w:sz="1" w:space="0" w:color="000000"/>
+              <w:bottom w:val="single" w:sz="1" w:space="0" w:color="000000"/>
+              <w:left w:val="single" w:sz="1" w:space="0" w:color="000000"/>
+              <w:right w:val="single" w:sz="1" w:space="0" w:color="000000"/>
+            </w:tcBorders>
+          </w:tcPr>
+          <w:p>
+            <w:pPr>
+              <w:spacing w:lineRule="auto"/>
+            </w:pPr>
+            <w:r>
+              <w:rPr/>
+              <w:t xml:space="preserve">→ </w:t>
             </w:r>
           </w:p>
           <w:p>
@@ -2373,7 +2409,7 @@
             </w:pPr>
             <w:r>
               <w:rPr/>
-              <w:t xml:space="preserve"> circondato da spazi â†’ </w:t>
+              <w:t xml:space="preserve"> circondato da spazi → </w:t>
             </w:r>
           </w:p>
           <w:p>
@@ -2513,7 +2549,7 @@
             </w:pPr>
             <w:r>
               <w:rPr/>
-              <w:t xml:space="preserve"> attaccato â†’ </w:t>
+              <w:t xml:space="preserve"> attaccato → </w:t>
             </w:r>
           </w:p>
           <w:p>
@@ -2578,7 +2614,7 @@
             </w:pPr>
             <w:r>
               <w:rPr/>
-              <w:t xml:space="preserve"> con spazio dopo â†’ </w:t>
+              <w:t xml:space="preserve"> con spazio dopo → </w:t>
             </w:r>
           </w:p>
           <w:p>
@@ -2617,7 +2653,7 @@
       </w:r>
       <w:r>
         <w:rPr/>
-        <w:t xml:space="preserve"> Ã¨ ambiguo, </w:t>
+        <w:t xml:space="preserve"> è ambiguo, </w:t>
       </w:r>
       <w:r>
         <w:rPr>
@@ -2635,7 +2671,7 @@
       </w:r>
       <w:r>
         <w:rPr/>
-        <w:t xml:space="preserve"> Ã¨ un range; </w:t>
+        <w:t xml:space="preserve"> è un range; </w:t>
       </w:r>
       <w:r>
         <w:rPr/>
@@ -2643,7 +2679,7 @@
       </w:r>
       <w:r>
         <w:rPr/>
-        <w:t xml:space="preserve"> Ã¨ un ternario perchÃ© i due spazi lo circondano.</w:t>
+        <w:t xml:space="preserve"> è un ternario perché i due spazi lo circondano.</w:t>
       </w:r>
     </w:p>
     <w:p>
@@ -2781,7 +2817,7 @@
       </w:r>
       <w:r>
         <w:rPr/>
-        <w:t xml:space="preserve">etÃ </w:t>
+        <w:t xml:space="preserve">età</w:t>
       </w:r>
       <w:r>
         <w:rPr/>
@@ -2789,7 +2825,7 @@
       </w:r>
       <w:r>
         <w:rPr/>
-        <w:t xml:space="preserve">Ï€</w:t>
+        <w:t xml:space="preserve">π</w:t>
       </w:r>
       <w:r>
         <w:rPr/>
@@ -2797,7 +2833,7 @@
       </w:r>
       <w:r>
         <w:rPr/>
-        <w:t xml:space="preserve">Î”x</w:t>
+        <w:t xml:space="preserve">Δx</w:t>
       </w:r>
       <w:r>
         <w:rPr/>
@@ -2818,7 +2854,7 @@
         <w:rPr>
           <w:rFonts w:ascii="Courier" w:hAnsi="Courier"/>
         </w:rPr>
-        <w:t xml:space="preserve">etÃ  = 42 Ï€ = 3.14159 Î”x = 0.001 println(etÃ  + Ï€) </w:t>
+        <w:t xml:space="preserve">età = 42 π = 3.14159 Δx = 0.001 println(età + π) </w:t>
       </w:r>
     </w:p>
     <w:p>
@@ -3020,7 +3056,7 @@
       </w:r>
       <w:r>
         <w:rPr/>
-        <w:t xml:space="preserve">\u{â€¦}</w:t>
+        <w:t xml:space="preserve">\u{…}</w:t>
       </w:r>
       <w:r>
         <w:rPr/>
@@ -3028,7 +3064,7 @@
       </w:r>
       <w:r>
         <w:rPr/>
-        <w:t xml:space="preserve">\x{â€¦}</w:t>
+        <w:t xml:space="preserve">\x{…}</w:t>
       </w:r>
       <w:r>
         <w:rPr/>
@@ -3058,7 +3094,7 @@
       </w:pPr>
       <w:r>
         <w:rPr/>
-        <w:t xml:space="preserve">Una stringa puÃ² contenere qualsiasi byte UTF-8 valido; un byte non valido produce un errore di parsing. Le stringhe sono </w:t>
+        <w:t xml:space="preserve">Una stringa può contenere qualsiasi byte UTF-8 valido; un byte non valido produce un errore di parsing. Le stringhe sono </w:t>
       </w:r>
       <w:r>
         <w:rPr>
@@ -3085,7 +3121,7 @@
         <w:rPr>
           <w:rFonts w:ascii="Courier" w:hAnsi="Courier"/>
         </w:rPr>
-        <w:t xml:space="preserve">a = "ciao" b = a * " mondo" println(a)        # "ciao" â€” inalterato println(b)        # "ciao mondo" </w:t>
+        <w:t xml:space="preserve">a = "ciao" b = a * " mondo" println(a)        # "ciao" — inalterato println(b)        # "ciao mondo" </w:t>
       </w:r>
     </w:p>
     <w:p>
@@ -3130,7 +3166,7 @@
       </w:pPr>
       <w:r>
         <w:rPr/>
-        <w:t xml:space="preserve">Scrivi un programma che stampi il tuo nome e la tua etÃ  su due righe, usando </w:t>
+        <w:t xml:space="preserve">Scrivi un programma che stampi il tuo nome e la tua età su due righe, usando </w:t>
       </w:r>
       <w:r>
         <w:rPr/>
@@ -4090,7 +4126,7 @@
             </w:pPr>
             <w:r>
               <w:rPr/>
-              <w:t xml:space="preserve">â€”</w:t>
+              <w:t xml:space="preserve">—</w:t>
             </w:r>
           </w:p>
         </w:tc>
@@ -4165,7 +4201,7 @@
             </w:pPr>
             <w:r>
               <w:rPr/>
-              <w:t xml:space="preserve">â€”</w:t>
+              <w:t xml:space="preserve">—</w:t>
             </w:r>
           </w:p>
         </w:tc>
@@ -4238,7 +4274,7 @@
             </w:pPr>
             <w:r>
               <w:rPr/>
-              <w:t xml:space="preserve">â€”</w:t>
+              <w:t xml:space="preserve">—</w:t>
             </w:r>
           </w:p>
         </w:tc>
@@ -4311,7 +4347,7 @@
             </w:pPr>
             <w:r>
               <w:rPr/>
-              <w:t xml:space="preserve">â€”</w:t>
+              <w:t xml:space="preserve">—</w:t>
             </w:r>
           </w:p>
         </w:tc>
@@ -4406,7 +4442,7 @@
       </w:pPr>
       <w:r>
         <w:rPr/>
-        <w:t xml:space="preserve">Il set dei tipi Core Ã¨ </w:t>
+        <w:t xml:space="preserve">Il set dei tipi Core è </w:t>
       </w:r>
       <w:r>
         <w:rPr>
@@ -4504,7 +4540,7 @@
       </w:r>
       <w:r>
         <w:rPr/>
-        <w:t xml:space="preserve"> come valori del linguaggio: un errore Ã¨ una lista taggata </w:t>
+        <w:t xml:space="preserve"> come valori del linguaggio: un errore è una lista taggata </w:t>
       </w:r>
       <w:r>
         <w:rPr/>
@@ -4512,7 +4548,7 @@
       </w:r>
       <w:r>
         <w:rPr/>
-        <w:t xml:space="preserve"> (cap. 11) e una struct Ã¨ </w:t>
+        <w:t xml:space="preserve"> (cap. 11) e una struct è </w:t>
       </w:r>
       <w:r>
         <w:rPr/>
@@ -4607,7 +4643,7 @@
       </w:r>
       <w:r>
         <w:rPr/>
-        <w:t xml:space="preserve">, e ogni tipo Ã¨ sottotipo di </w:t>
+        <w:t xml:space="preserve">, e ogni tipo è sottotipo di </w:t>
       </w:r>
       <w:r>
         <w:rPr/>
@@ -4623,7 +4659,7 @@
       </w:r>
       <w:r>
         <w:rPr/>
-        <w:t xml:space="preserve"> Ã¨ il supertipo usato nelle firme quando un parametro accetta qualunque cosa. </w:t>
+        <w:t xml:space="preserve"> è il supertipo usato nelle firme quando un parametro accetta qualunque cosa. </w:t>
       </w:r>
       <w:r>
         <w:rPr>
@@ -4667,7 +4703,7 @@
       </w:r>
       <w:r>
         <w:rPr/>
-        <w:t xml:space="preserve"> Ã¨ un record immutabile con campi tipizzati e costruttore posizionale. Il costruttore controlla i campi; un </w:t>
+        <w:t xml:space="preserve"> è un record immutabile con campi tipizzati e costruttore posizionale. Il costruttore controlla i campi; un </w:t>
       </w:r>
       <w:r>
         <w:rPr/>
@@ -4757,7 +4793,7 @@
       </w:r>
       <w:r>
         <w:rPr/>
-        <w:t xml:space="preserve">, con il simbolo del tipo in prima posizione. Ãˆ cosÃ¬ che gli interpreti di </w:t>
+        <w:t xml:space="preserve">, con il simbolo del tipo in prima posizione. È così che gli interpreti di </w:t>
       </w:r>
       <w:r>
         <w:rPr/>
@@ -4963,7 +4999,7 @@
       </w:r>
       <w:r>
         <w:rPr/>
-        <w:t xml:space="preserve"> se Ã¨ di tipo </w:t>
+        <w:t xml:space="preserve"> se è di tipo </w:t>
       </w:r>
       <w:r>
         <w:rPr/>
@@ -5019,7 +5055,7 @@
       </w:r>
       <w:r>
         <w:rPr/>
-        <w:t xml:space="preserve"> â€” e un parametro </w:t>
+        <w:t xml:space="preserve"> — e un parametro </w:t>
       </w:r>
       <w:r>
         <w:rPr/>
@@ -5027,7 +5063,7 @@
       </w:r>
       <w:r>
         <w:rPr/>
-        <w:t xml:space="preserve"> â€” </w:t>
+        <w:t xml:space="preserve"> — </w:t>
       </w:r>
       <w:r>
         <w:rPr>
@@ -5049,7 +5085,7 @@
       </w:r>
       <w:r>
         <w:rPr/>
-        <w:t xml:space="preserve">x::U = â€¦</w:t>
+        <w:t xml:space="preserve">x::U = …</w:t>
       </w:r>
       <w:r>
         <w:rPr/>
@@ -5078,7 +5114,7 @@
         <w:rPr>
           <w:rFonts w:ascii="Courier" w:hAnsi="Courier"/>
         </w:rPr>
-        <w:t xml:space="preserve">x::Int = 5 x = 6            # bene x = 5.5          # Err(:type)  y::Float = 1.0 y = 2            # 2.0: conversione Int -&gt; Float  s = "a" s = 3            # bene: s non Ã¨ dichiarato con un tipo </w:t>
+        <w:t xml:space="preserve">x::Int = 5 x = 6            # bene x = 5.5          # Err(:type)  y::Float = 1.0 y = 2            # 2.0: conversione Int -&gt; Float  s = "a" s = 3            # bene: s non è dichiarato con un tipo </w:t>
       </w:r>
     </w:p>
     <w:p>
@@ -5109,7 +5145,7 @@
       </w:r>
       <w:r>
         <w:rPr/>
-        <w:t xml:space="preserve"> Ã¨ un errore, non </w:t>
+        <w:t xml:space="preserve"> è un errore, non </w:t>
       </w:r>
       <w:r>
         <w:rPr/>
@@ -5460,7 +5496,7 @@
             </w:pPr>
             <w:r>
               <w:rPr/>
-              <w:t xml:space="preserve">cosÃ¬ com'Ã¨</w:t>
+              <w:t xml:space="preserve">così com'è</w:t>
             </w:r>
           </w:p>
         </w:tc>
@@ -5773,7 +5809,17 @@
       </w:r>
       <w:r>
         <w:rPr/>
-        <w:t xml:space="preserve"> (anche annidate), le funzioni **per identitÃ **. </w:t>
+        <w:t xml:space="preserve"> (anche annidate), le funzioni </w:t>
+      </w:r>
+      <w:r>
+        <w:rPr>
+          <w:b/>
+        </w:rPr>
+        <w:t xml:space="preserve">per identità</w:t>
+      </w:r>
+      <w:r>
+        <w:rPr/>
+        <w:t xml:space="preserve">. </w:t>
       </w:r>
       <w:r>
         <w:rPr>
@@ -5853,7 +5899,7 @@
         <w:rPr>
           <w:b/>
         </w:rPr>
-        <w:t xml:space="preserve">Ã¨ un'espressione</w:t>
+        <w:t xml:space="preserve">è un'espressione</w:t>
       </w:r>
       <w:r>
         <w:rPr/>
@@ -5881,7 +5927,7 @@
       </w:r>
       <w:r>
         <w:rPr/>
-        <w:t xml:space="preserve"> aggiornano una variabile esistente e valutano il lato sinistro una volta sola. Usare un nome mai assegnato Ã¨ un errore di esecuzione. </w:t>
+        <w:t xml:space="preserve"> aggiornano una variabile esistente e valutano il lato sinistro una volta sola. Usare un nome mai assegnato è un errore di esecuzione. </w:t>
       </w:r>
       <w:r>
         <w:rPr>
@@ -5929,7 +5975,17 @@
       </w:pPr>
       <w:r>
         <w:rPr/>
-        <w:t xml:space="preserve">Non esistono dichiarazioni: le variabili sono dinamiche. Le regole di **visibilitÃ ** si vedono nel capitolo 8.</w:t>
+        <w:t xml:space="preserve">Non esistono dichiarazioni: le variabili sono dinamiche. Le regole di </w:t>
+      </w:r>
+      <w:r>
+        <w:rPr>
+          <w:b/>
+        </w:rPr>
+        <w:t xml:space="preserve">visibilità</w:t>
+      </w:r>
+      <w:r>
+        <w:rPr/>
+        <w:t xml:space="preserve"> si vedono nel capitolo 8.</w:t>
       </w:r>
     </w:p>
     <w:p>
@@ -5960,7 +6016,7 @@
       </w:pPr>
       <w:r>
         <w:rPr/>
-        <w:t xml:space="preserve">Il parser Ã¨ un </w:t>
+        <w:t xml:space="preserve">Il parser è un </w:t>
       </w:r>
       <w:r>
         <w:rPr>
@@ -5970,7 +6026,7 @@
       </w:r>
       <w:r>
         <w:rPr/>
-        <w:t xml:space="preserve"> con dodici livelli. Dalla precedenza piÃ¹ bassa alla piÃ¹ alta:</w:t>
+        <w:t xml:space="preserve"> con dodici livelli. Dalla precedenza più bassa alla più alta:</w:t>
       </w:r>
     </w:p>
     <w:tbl>
@@ -6050,7 +6106,7 @@
             </w:pPr>
             <w:r>
               <w:rPr/>
-              <w:t xml:space="preserve">associativitÃ</w:t>
+              <w:t xml:space="preserve">associatività</w:t>
             </w:r>
           </w:p>
         </w:tc>
@@ -7179,7 +7235,7 @@
       </w:r>
       <w:r>
         <w:rPr/>
-        <w:t xml:space="preserve"> Ã¨ il </w:t>
+        <w:t xml:space="preserve"> è il </w:t>
       </w:r>
       <w:r>
         <w:rPr>
@@ -7222,7 +7278,7 @@
       </w:r>
       <w:r>
         <w:rPr/>
-        <w:t xml:space="preserve"> con esponente negativo Ã¨ un errore; </w:t>
+        <w:t xml:space="preserve"> con esponente negativo è un errore; </w:t>
       </w:r>
       <w:r>
         <w:rPr/>
@@ -7230,7 +7286,7 @@
       </w:r>
       <w:r>
         <w:rPr/>
-        <w:t xml:space="preserve"> per zero Ã¨ un errore;</w:t>
+        <w:t xml:space="preserve"> per zero è un errore;</w:t>
       </w:r>
     </w:p>
     <w:p>
@@ -7255,7 +7311,7 @@
       </w:r>
       <w:r>
         <w:rPr/>
-        <w:t xml:space="preserve">: la divisione Ã¨ di Triad-Full.</w:t>
+        <w:t xml:space="preserve">: la divisione è di Triad-Full.</w:t>
       </w:r>
     </w:p>
     <w:p>
@@ -7305,7 +7361,7 @@
       </w:r>
       <w:r>
         <w:rPr/>
-        <w:t xml:space="preserve">: l'esponente Ã¨ associativo a destra, come in matematica.</w:t>
+        <w:t xml:space="preserve">: l'esponente è associativo a destra, come in matematica.</w:t>
       </w:r>
     </w:p>
     <w:p>
@@ -7354,7 +7410,7 @@
       </w:r>
       <w:r>
         <w:rPr/>
-        <w:t xml:space="preserve"> Ã¨ un errore (si confronta </w:t>
+        <w:t xml:space="preserve"> è un errore (si confronta </w:t>
       </w:r>
       <w:r>
         <w:rPr/>
@@ -7446,7 +7502,7 @@
         <w:rPr>
           <w:b/>
         </w:rPr>
-        <w:t xml:space="preserve">tutto Ã¨ un'espressione</w:t>
+        <w:t xml:space="preserve">tutto è un'espressione</w:t>
       </w:r>
       <w:r>
         <w:rPr/>
@@ -7490,7 +7546,7 @@
       </w:r>
       <w:r>
         <w:rPr/>
-        <w:t xml:space="preserve"> se non ce n'Ã¨).</w:t>
+        <w:t xml:space="preserve"> se non ce n'è).</w:t>
       </w:r>
     </w:p>
     <w:p>
@@ -7576,7 +7632,7 @@
       </w:r>
       <w:r>
         <w:rPr/>
-        <w:t xml:space="preserve"> Ã¨ la forma breve di </w:t>
+        <w:t xml:space="preserve"> è la forma breve di </w:t>
       </w:r>
       <w:r>
         <w:rPr/>
@@ -7661,7 +7717,7 @@
         <w:rPr>
           <w:b/>
         </w:rPr>
-        <w:t xml:space="preserve">piÃ¹ interno</w:t>
+        <w:t xml:space="preserve">più interno</w:t>
       </w:r>
       <w:r>
         <w:rPr/>
@@ -7784,7 +7840,7 @@
       </w:r>
       <w:r>
         <w:rPr/>
-        <w:t xml:space="preserve">begin â€¦ end</w:t>
+        <w:t xml:space="preserve">begin … end</w:t>
       </w:r>
       <w:r>
         <w:rPr/>
@@ -7946,7 +8002,7 @@
       </w:r>
       <w:r>
         <w:rPr/>
-        <w:t xml:space="preserve"> dentro un indicatore Ã¨ l'ultimo elemento. La destrutturazione nel </w:t>
+        <w:t xml:space="preserve"> dentro un indicatore è l'ultimo elemento. La destrutturazione nel </w:t>
       </w:r>
       <w:r>
         <w:rPr/>
@@ -7954,7 +8010,7 @@
       </w:r>
       <w:r>
         <w:rPr/>
-        <w:t xml:space="preserve"> Ã¨ trattata nel capitolo 24.</w:t>
+        <w:t xml:space="preserve"> è trattata nel capitolo 24.</w:t>
       </w:r>
     </w:p>
     <w:p>
@@ -8065,7 +8121,7 @@
       </w:pPr>
       <w:r>
         <w:rPr/>
-        <w:t xml:space="preserve">In Full l'errore Ã¨ un </w:t>
+        <w:t xml:space="preserve">In Full l'errore è un </w:t>
       </w:r>
       <w:r>
         <w:rPr>
@@ -8191,7 +8247,7 @@
         <w:rPr>
           <w:rFonts w:ascii="Courier" w:hAnsi="Courier"/>
         </w:rPr>
-        <w:t xml:space="preserve"># forma breve: il corpo Ã¨ un'espressione quadrato(x) = x * x  # forma blocco: il valore Ã¨ quello dell'ultima espressione function calcola(n)     m = n + 1     m * 2 end  # funzione anonima assegnata a un nome moltiplica = function (a, b)     a * b end  println(quadrato(4), " ", calcola(3), " ", moltiplica(6, 7)) </w:t>
+        <w:t xml:space="preserve"># forma breve: il corpo è un'espressione quadrato(x) = x * x  # forma blocco: il valore è quello dell'ultima espressione function calcola(n)     m = n + 1     m * 2 end  # funzione anonima assegnata a un nome moltiplica = function (a, b)     a * b end  println(quadrato(4), " ", calcola(3), " ", moltiplica(6, 7)) </w:t>
       </w:r>
     </w:p>
     <w:p>
@@ -8231,7 +8287,7 @@
       </w:r>
       <w:r>
         <w:rPr/>
-        <w:t xml:space="preserve">, ricorsione, aritÃ</w:t>
+        <w:t xml:space="preserve">, ricorsione, arità</w:t>
       </w:r>
     </w:p>
     <w:p>
@@ -8260,7 +8316,7 @@
       </w:r>
       <w:r>
         <w:rPr/>
-        <w:t xml:space="preserve">. Una funzione nominata Ã¨ visibile nel proprio corpo, quindi la ricorsione diretta funziona. Il numero di argomenti deve coincidere con i parametri. </w:t>
+        <w:t xml:space="preserve">. Una funzione nominata è visibile nel proprio corpo, quindi la ricorsione diretta funziona. Il numero di argomenti deve coincidere con i parametri. </w:t>
       </w:r>
       <w:r>
         <w:rPr>
@@ -8412,7 +8468,7 @@
       </w:r>
       <w:r>
         <w:rPr/>
-        <w:t xml:space="preserve"> funzionano perchÃ© anche gli </w:t>
+        <w:t xml:space="preserve"> funzionano perché anche gli </w:t>
       </w:r>
       <w:r>
         <w:rPr>
@@ -8463,7 +8519,7 @@
       </w:r>
       <w:r>
         <w:rPr/>
-        <w:t xml:space="preserve">: scriverla rende il codice giÃ  pronto per Full. </w:t>
+        <w:t xml:space="preserve">: scriverla rende il codice già pronto per Full. </w:t>
       </w:r>
       <w:r>
         <w:rPr>
@@ -8533,13 +8589,13 @@
       </w:pPr>
       <w:r>
         <w:rPr/>
-        <w:t xml:space="preserve">Una funzione generica Ã¨ un insieme di metodi. Ridefinire la stessa firma sostituisce il metodo precedente. Tra i metodi applicabili (stessa aritÃ , ogni argomento sottotipo del parametro) vince il </w:t>
+        <w:t xml:space="preserve">Una funzione generica è un insieme di metodi. Ridefinire la stessa firma sostituisce il metodo precedente. Tra i metodi applicabili (stessa arità, ogni argomento sottotipo del parametro) vince il </w:t>
       </w:r>
       <w:r>
         <w:rPr>
           <w:b/>
         </w:rPr>
-        <w:t xml:space="preserve">piÃ¹ specifico</w:t>
+        <w:t xml:space="preserve">più specifico</w:t>
       </w:r>
       <w:r>
         <w:rPr/>
@@ -8591,7 +8647,7 @@
       </w:pPr>
       <w:r>
         <w:rPr/>
-        <w:t xml:space="preserve">Un metodo A Ã¨ piÃ¹ specifico di B se ogni suo parametro Ã¨ sottotipo del corrispondente parametro di B e le firme differiscono.</w:t>
+        <w:t xml:space="preserve">Un metodo A è più specifico di B se ogni suo parametro è sottotipo del corrispondente parametro di B e le firme differiscono.</w:t>
       </w:r>
     </w:p>
     <w:p>
@@ -8604,7 +8660,7 @@
       </w:pPr>
       <w:r>
         <w:rPr/>
-        <w:t xml:space="preserve">Se nessun metodo Ã¨ applicabile: </w:t>
+        <w:t xml:space="preserve">Se nessun metodo è applicabile: </w:t>
       </w:r>
       <w:r>
         <w:rPr/>
@@ -8625,7 +8681,7 @@
       </w:pPr>
       <w:r>
         <w:rPr/>
-        <w:t xml:space="preserve">Se piÃ¹ metodi sono massimali: </w:t>
+        <w:t xml:space="preserve">Se più metodi sono massimali: </w:t>
       </w:r>
       <w:r>
         <w:rPr/>
@@ -8646,7 +8702,7 @@
       </w:pPr>
       <w:r>
         <w:rPr/>
-        <w:t xml:space="preserve">Se il nome Ã¨ anche un builtin (per esempio </w:t>
+        <w:t xml:space="preserve">Se il nome è anche un builtin (per esempio </w:t>
       </w:r>
       <w:r>
         <w:rPr/>
@@ -8719,7 +8775,7 @@
       </w:r>
       <w:r>
         <w:rPr/>
-        <w:t xml:space="preserve"> Ã¨ controllato all'uscita, con la conversione </w:t>
+        <w:t xml:space="preserve"> è controllato all'uscita, con la conversione </w:t>
       </w:r>
       <w:r>
         <w:rPr/>
@@ -8727,7 +8783,7 @@
       </w:r>
       <w:r>
         <w:rPr/>
-        <w:t xml:space="preserve">. Se il valore non Ã¨ conforme: </w:t>
+        <w:t xml:space="preserve">. Se il valore non è conforme: </w:t>
       </w:r>
       <w:r>
         <w:rPr/>
@@ -8752,7 +8808,7 @@
         <w:rPr>
           <w:rFonts w:ascii="Courier" w:hAnsi="Courier"/>
         </w:rPr>
-        <w:t xml:space="preserve">function metÃ (n::Number)::Float     n / 2 end println(metÃ (3)) </w:t>
+        <w:t xml:space="preserve">function metà(n::Number)::Float     n / 2 end println(metà(3)) </w:t>
       </w:r>
     </w:p>
     <w:p>
@@ -8801,7 +8857,7 @@
       </w:r>
       <w:r>
         <w:rPr/>
-        <w:t xml:space="preserve"> definita dentro un'altra funzione Ã¨ una </w:t>
+        <w:t xml:space="preserve"> definita dentro un'altra funzione è una </w:t>
       </w:r>
       <w:r>
         <w:rPr>
@@ -8908,11 +8964,11 @@
       </w:pPr>
       <w:r>
         <w:rPr/>
-        <w:t xml:space="preserve">Una lambda con corpo a piÃ¹ istruzioni si scrive con </w:t>
-      </w:r>
-      <w:r>
-        <w:rPr/>
-        <w:t xml:space="preserve">begin â€¦ end</w:t>
+        <w:t xml:space="preserve">Una lambda con corpo a più istruzioni si scrive con </w:t>
+      </w:r>
+      <w:r>
+        <w:rPr/>
+        <w:t xml:space="preserve">begin … end</w:t>
       </w:r>
       <w:r>
         <w:rPr/>
@@ -8920,7 +8976,7 @@
       </w:r>
       <w:r>
         <w:rPr/>
-        <w:t xml:space="preserve">function (â€¦) â€¦ end</w:t>
+        <w:t xml:space="preserve">function (…) … end</w:t>
       </w:r>
       <w:r>
         <w:rPr/>
@@ -8928,7 +8984,7 @@
       </w:r>
       <w:r>
         <w:rPr/>
-        <w:t xml:space="preserve">() -&gt; â€¦</w:t>
+        <w:t xml:space="preserve">() -&gt; …</w:t>
       </w:r>
       <w:r>
         <w:rPr/>
@@ -8946,7 +9002,7 @@
       </w:r>
       <w:r>
         <w:rPr/>
-        <w:t xml:space="preserve">function () â€¦ end</w:t>
+        <w:t xml:space="preserve">function () … end</w:t>
       </w:r>
       <w:r>
         <w:rPr/>
@@ -8969,11 +9025,11 @@
       </w:pPr>
       <w:r>
         <w:rPr/>
-        <w:t xml:space="preserve">Una lambda cattura l'ambiente in cui Ã¨ creata. Secondo </w:t>
-      </w:r>
-      <w:r>
-        <w:rPr/>
-        <w:t xml:space="preserve">SPEC-CORE Â§5</w:t>
+        <w:t xml:space="preserve">Una lambda cattura l'ambiente in cui è creata. Secondo </w:t>
+      </w:r>
+      <w:r>
+        <w:rPr/>
+        <w:t xml:space="preserve">SPEC-CORE §5</w:t>
       </w:r>
       <w:r>
         <w:rPr/>
@@ -9061,7 +9117,7 @@
       </w:r>
       <w:r>
         <w:rPr/>
-        <w:t xml:space="preserve"> puÃ² non funzionare sul seed. L'interprete JS e la specifica usano il modello condiviso.</w:t>
+        <w:t xml:space="preserve"> può non funzionare sul seed. L'interprete JS e la specifica usano il modello condiviso.</w:t>
       </w:r>
     </w:p>
     <w:p>
@@ -9122,7 +9178,7 @@
       </w:r>
       <w:r>
         <w:rPr/>
-        <w:t xml:space="preserve">; un nome Ã¨ visibile nell'ambiente in cui Ã¨ legato e in quelli interni (scope lessicale), mai in quelli esterni.</w:t>
+        <w:t xml:space="preserve">; un nome è visibile nell'ambiente in cui è legato e in quelli interni (scope lessicale), mai in quelli esterni.</w:t>
       </w:r>
     </w:p>
     <w:p>
@@ -9170,7 +9226,7 @@
       </w:r>
       <w:r>
         <w:rPr/>
-        <w:t xml:space="preserve"> l'assegnamento a un nome giÃ  legato fuori aggiorna quel legame.</w:t>
+        <w:t xml:space="preserve"> l'assegnamento a un nome già legato fuori aggiorna quel legame.</w:t>
       </w:r>
     </w:p>
     <w:p>
@@ -9202,7 +9258,7 @@
       </w:pPr>
       <w:r>
         <w:rPr/>
-        <w:t xml:space="preserve">let x = â€¦</w:t>
+        <w:t xml:space="preserve">let x = …</w:t>
       </w:r>
       <w:r>
         <w:rPr/>
@@ -9280,7 +9336,7 @@
       </w:pPr>
       <w:r>
         <w:rPr/>
-        <w:t xml:space="preserve">Per far uscire un risultato da una funzione, restituiscilo â€” oppure usa una lista, che Ã¨ mutabile.</w:t>
+        <w:t xml:space="preserve">Per far uscire un risultato da una funzione, restituiscilo — oppure usa una lista, che è mutabile.</w:t>
       </w:r>
     </w:p>
     <w:p>
@@ -9311,7 +9367,7 @@
       </w:pPr>
       <w:r>
         <w:rPr/>
-        <w:t xml:space="preserve">Una lista Ã¨ eterogenea, annidabile e </w:t>
+        <w:t xml:space="preserve">Una lista è eterogenea, annidabile e </w:t>
       </w:r>
       <w:r>
         <w:rPr>
@@ -9731,7 +9787,7 @@
               <w:rPr>
                 <w:highlight w:val="lightGray"/>
               </w:rPr>
-              <w:t xml:space="preserve">length("Ã©") == 2</w:t>
+              <w:t xml:space="preserve">length("é") == 2</w:t>
             </w:r>
           </w:p>
           <w:p>
@@ -10127,13 +10183,13 @@
       </w:pPr>
       <w:r>
         <w:rPr/>
-        <w:t xml:space="preserve">Questa Ã¨ una delle idee portanti di Triad: </w:t>
+        <w:t xml:space="preserve">Questa è una delle idee portanti di Triad: </w:t>
       </w:r>
       <w:r>
         <w:rPr>
           <w:b/>
         </w:rPr>
-        <w:t xml:space="preserve">l'errore Ã¨ un valore</w:t>
+        <w:t xml:space="preserve">l'errore è un valore</w:t>
       </w:r>
       <w:r>
         <w:rPr/>
@@ -10160,7 +10216,7 @@
       </w:pPr>
       <w:r>
         <w:rPr/>
-        <w:t xml:space="preserve">Un errore Ã¨ un valore </w:t>
+        <w:t xml:space="preserve">Un errore è un valore </w:t>
       </w:r>
       <w:r>
         <w:rPr/>
@@ -10185,7 +10241,7 @@
       </w:r>
       <w:r>
         <w:rPr/>
-        <w:t xml:space="preserve"> â€” la categoria, su cui si puÃ² fare dispatch;</w:t>
+        <w:t xml:space="preserve"> — la categoria, su cui si può fare dispatch;</w:t>
       </w:r>
     </w:p>
     <w:p>
@@ -10202,7 +10258,7 @@
       </w:r>
       <w:r>
         <w:rPr/>
-        <w:t xml:space="preserve"> â€” il messaggio;</w:t>
+        <w:t xml:space="preserve"> — il messaggio;</w:t>
       </w:r>
     </w:p>
     <w:p>
@@ -10219,7 +10275,7 @@
       </w:r>
       <w:r>
         <w:rPr/>
-        <w:t xml:space="preserve"> â€” un valore qualsiasi, spesso un record </w:t>
+        <w:t xml:space="preserve"> — un valore qualsiasi, spesso un record </w:t>
       </w:r>
       <w:r>
         <w:rPr/>
@@ -10491,7 +10547,7 @@
               <w:rPr>
                 <w:highlight w:val="lightGray"/>
               </w:rPr>
-              <w:t xml:space="preserve">Err(:error, â€¦)</w:t>
+              <w:t xml:space="preserve">Err(:error, …)</w:t>
             </w:r>
           </w:p>
           <w:p>
@@ -10583,7 +10639,7 @@
             </w:pPr>
             <w:r>
               <w:rPr/>
-              <w:t xml:space="preserve"> Ã¨ legato all'</w:t>
+              <w:t xml:space="preserve"> è legato all'</w:t>
             </w:r>
           </w:p>
           <w:p>
@@ -10731,7 +10787,7 @@
             </w:pPr>
             <w:r>
               <w:rPr/>
-              <w:t xml:space="preserve"> Ã¨ un </w:t>
+              <w:t xml:space="preserve"> è un </w:t>
             </w:r>
           </w:p>
           <w:p>
@@ -10762,7 +10818,7 @@
       </w:pPr>
       <w:r>
         <w:rPr/>
-        <w:t xml:space="preserve">Tutti i fallimenti del linguaggio â€” divisione intera per zero, </w:t>
+        <w:t xml:space="preserve">Tutti i fallimenti del linguaggio — divisione intera per zero, </w:t>
       </w:r>
       <w:r>
         <w:rPr/>
@@ -10770,7 +10826,7 @@
       </w:r>
       <w:r>
         <w:rPr/>
-        <w:t xml:space="preserve">, indici fuori range, nessun metodo applicabile â€” arrivano come </w:t>
+        <w:t xml:space="preserve">, indici fuori range, nessun metodo applicabile — arrivano come </w:t>
       </w:r>
       <w:r>
         <w:rPr/>
@@ -11247,7 +11303,7 @@
             </w:pPr>
             <w:r>
               <w:rPr/>
-              <w:t xml:space="preserve">piÃ¹ metodi ugualmente specifici</w:t>
+              <w:t xml:space="preserve">più metodi ugualmente specifici</w:t>
             </w:r>
           </w:p>
         </w:tc>
@@ -11600,11 +11656,11 @@
       </w:r>
       <w:r>
         <w:rPr/>
-        <w:t xml:space="preserve">riga 12: â€¦</w:t>
-      </w:r>
-      <w:r>
-        <w:rPr/>
-        <w:t xml:space="preserve">) e il codice di uscita Ã¨ </w:t>
+        <w:t xml:space="preserve">riga 12: …</w:t>
+      </w:r>
+      <w:r>
+        <w:rPr/>
+        <w:t xml:space="preserve">) e il codice di uscita è </w:t>
       </w:r>
       <w:r>
         <w:rPr/>
@@ -11647,7 +11703,7 @@
       </w:r>
       <w:r>
         <w:rPr/>
-        <w:t xml:space="preserve"> nÃ© il tipo </w:t>
+        <w:t xml:space="preserve"> né il tipo </w:t>
       </w:r>
       <w:r>
         <w:rPr/>
@@ -11673,7 +11729,7 @@
       </w:r>
       <w:r>
         <w:rPr/>
-        <w:t xml:space="preserve"> e un messaggio diagnostico su stderr. Ma il pattern "errore come dato" si puÃ² giÃ  scrivere, ed Ã¨ esattamente cosÃ¬ che S1 implementerÃ  Full. La convenzione Ã¨ </w:t>
+        <w:t xml:space="preserve"> e un messaggio diagnostico su stderr. Ma il pattern "errore come dato" si può già scrivere, ed è esattamente così che S1 implementerà Full. La convenzione è </w:t>
       </w:r>
       <w:r>
         <w:rPr/>
@@ -11753,7 +11809,7 @@
       </w:r>
       <w:r>
         <w:rPr/>
-        <w:t xml:space="preserve"> Ã¨ una lista di 3 elementi.</w:t>
+        <w:t xml:space="preserve"> è una lista di 3 elementi.</w:t>
       </w:r>
     </w:p>
     <w:p>
@@ -11784,7 +11840,7 @@
       </w:pPr>
       <w:r>
         <w:rPr/>
-        <w:t xml:space="preserve">Un contratto Ã¨ una precondizione (</w:t>
+        <w:t xml:space="preserve">Un contratto è una precondizione (</w:t>
       </w:r>
       <w:r>
         <w:rPr/>
@@ -11918,7 +11974,7 @@
       </w:r>
       <w:r>
         <w:rPr/>
-        <w:t xml:space="preserve"> della condizione: Ã¨ un dato, si puÃ² ispezionare.</w:t>
+        <w:t xml:space="preserve"> della condizione: è un dato, si può ispezionare.</w:t>
       </w:r>
     </w:p>
     <w:p>
@@ -11941,7 +11997,7 @@
       </w:r>
       <w:r>
         <w:rPr/>
-        <w:t xml:space="preserve">: un effetto dentro un contratto dÃ  </w:t>
+        <w:t xml:space="preserve">: un effetto dentro un contratto dà </w:t>
       </w:r>
       <w:r>
         <w:rPr/>
@@ -11995,7 +12051,7 @@
       </w:r>
       <w:r>
         <w:rPr/>
-        <w:t xml:space="preserve"> Ã¨ un </w:t>
+        <w:t xml:space="preserve"> è un </w:t>
       </w:r>
       <w:r>
         <w:rPr/>
@@ -12077,7 +12133,7 @@
       </w:r>
       <w:r>
         <w:rPr/>
-        <w:t xml:space="preserve"> limita quanti passi il programma puÃ² consumare. Un passo Ã¨ una chiamata, un'iterazione di ciclo o un passo di risoluzione. Quando il budget si esaurisce, </w:t>
+        <w:t xml:space="preserve"> limita quanti passi il programma può consumare. Un passo è una chiamata, un'iterazione di ciclo o un passo di risoluzione. Quando il budget si esaurisce, </w:t>
       </w:r>
       <w:r>
         <w:rPr>
@@ -12095,7 +12151,7 @@
         <w:rPr>
           <w:b/>
         </w:rPr>
-        <w:t xml:space="preserve"> Ã¨ </w:t>
+        <w:t xml:space="preserve"> è </w:t>
       </w:r>
       <w:r>
         <w:rPr>
@@ -12153,7 +12209,7 @@
       </w:pPr>
       <w:r>
         <w:rPr/>
-        <w:t xml:space="preserve">I budget si annidano e vale il piÃ¹ stretto. Un </w:t>
+        <w:t xml:space="preserve">I budget si annidano e vale il più stretto. Un </w:t>
       </w:r>
       <w:r>
         <w:rPr/>
@@ -12175,11 +12231,11 @@
       </w:r>
       <w:r>
         <w:rPr/>
-        <w:t xml:space="preserve">solve â€¦ steps N</w:t>
-      </w:r>
-      <w:r>
-        <w:rPr/>
-        <w:t xml:space="preserve"> Ã¨ il budget specifico di una query.</w:t>
+        <w:t xml:space="preserve">solve … steps N</w:t>
+      </w:r>
+      <w:r>
+        <w:rPr/>
+        <w:t xml:space="preserve"> è il budget specifico di una query.</w:t>
       </w:r>
     </w:p>
     <w:p>
@@ -12237,7 +12293,7 @@
       </w:pPr>
       <w:r>
         <w:rPr/>
-        <w:t xml:space="preserve">La traccia di un calcolo Ã¨ un </w:t>
+        <w:t xml:space="preserve">La traccia di un calcolo è un </w:t>
       </w:r>
       <w:r>
         <w:rPr>
@@ -12373,7 +12429,7 @@
       </w:r>
       <w:r>
         <w:rPr/>
-        <w:t xml:space="preserve"> sono 15 chiamate e 30 eventi â€” Ã¨ il valore atteso dal caso di conformance </w:t>
+        <w:t xml:space="preserve"> sono 15 chiamate e 30 eventi — è il valore atteso dal caso di conformance </w:t>
       </w:r>
       <w:r>
         <w:rPr/>
@@ -12390,7 +12446,7 @@
       </w:pPr>
       <w:r>
         <w:rPr/>
-        <w:t xml:space="preserve">with trace â€¦ end</w:t>
+        <w:t xml:space="preserve">with trace … end</w:t>
       </w:r>
       <w:r>
         <w:rPr/>
@@ -12422,7 +12478,7 @@
       </w:r>
       <w:r>
         <w:rPr/>
-        <w:t xml:space="preserve">solve â€¦ trace</w:t>
+        <w:t xml:space="preserve">solve … trace</w:t>
       </w:r>
       <w:r>
         <w:rPr/>
@@ -12442,7 +12498,7 @@
       </w:r>
       <w:r>
         <w:rPr/>
-        <w:t xml:space="preserve"> Ã¨ la lista delle soluzioni e gli eventi sono le porte del modello a scatole di Byrd (</w:t>
+        <w:t xml:space="preserve"> è la lista delle soluzioni e gli eventi sono le porte del modello a scatole di Byrd (</w:t>
       </w:r>
       <w:r>
         <w:rPr/>
@@ -12474,7 +12530,7 @@
       </w:r>
       <w:r>
         <w:rPr/>
-        <w:t xml:space="preserve">) piÃ¹ </w:t>
+        <w:t xml:space="preserve">) più </w:t>
       </w:r>
       <w:r>
         <w:rPr/>
@@ -12522,7 +12578,7 @@
       </w:r>
       <w:r>
         <w:rPr/>
-        <w:t xml:space="preserve">solve â€¦ trace</w:t>
+        <w:t xml:space="preserve">solve … trace</w:t>
       </w:r>
       <w:r>
         <w:rPr/>
@@ -12756,7 +12812,7 @@
             </w:pPr>
             <w:r>
               <w:rPr/>
-              <w:t xml:space="preserve">il goal Ã¨ dimostrato: Ã¨ il "success" della ricerca</w:t>
+              <w:t xml:space="preserve">il goal è dimostrato: è il "success" della ricerca</w:t>
             </w:r>
           </w:p>
         </w:tc>
@@ -12955,7 +13011,7 @@
       </w:r>
       <w:r>
         <w:rPr/>
-        <w:t xml:space="preserve"> della traccia, riferite al goal/clausola in corso. Il fallimento di un goal non Ã¨ un'eccezione: si manifesta come </w:t>
+        <w:t xml:space="preserve"> della traccia, riferite al goal/clausola in corso. Il fallimento di un goal non è un'eccezione: si manifesta come </w:t>
       </w:r>
       <w:r>
         <w:rPr>
@@ -12998,15 +13054,15 @@
       </w:r>
       <w:r>
         <w:rPr/>
-        <w:t xml:space="preserve"> appare come evento aggiuntivo quando un ramo viene tagliato dal limite di profonditÃ  (</w:t>
-      </w:r>
-      <w:r>
-        <w:rPr/>
-        <w:t xml:space="preserve">solve â€¦ depth N</w:t>
-      </w:r>
-      <w:r>
-        <w:rPr/>
-        <w:t xml:space="preserve">), segnalando che la ricerca Ã¨ stata interrotta prima di un </w:t>
+        <w:t xml:space="preserve"> appare come evento aggiuntivo quando un ramo viene tagliato dal limite di profondità (</w:t>
+      </w:r>
+      <w:r>
+        <w:rPr/>
+        <w:t xml:space="preserve">solve … depth N</w:t>
+      </w:r>
+      <w:r>
+        <w:rPr/>
+        <w:t xml:space="preserve">), segnalando che la ricerca è stata interrotta prima di un </w:t>
       </w:r>
       <w:r>
         <w:rPr/>
@@ -13090,7 +13146,7 @@
       </w:pPr>
       <w:r>
         <w:rPr/>
-        <w:t xml:space="preserve">Il riferimento di ogni evento Ã¨ il </w:t>
+        <w:t xml:space="preserve">Il riferimento di ogni evento è il </w:t>
       </w:r>
       <w:r>
         <w:rPr>
@@ -13116,7 +13172,7 @@
       </w:r>
       <w:r>
         <w:rPr/>
-        <w:t xml:space="preserve">, â€¦) coinvolte in quel passo: leggendo la traccia si ricostruisce </w:t>
+        <w:t xml:space="preserve">, …) coinvolte in quel passo: leggendo la traccia si ricostruisce </w:t>
       </w:r>
       <w:r>
         <w:rPr/>
@@ -13124,15 +13180,15 @@
       </w:r>
       <w:r>
         <w:rPr/>
-        <w:t xml:space="preserve"> alternativa Ã¨ stata provata e </w:t>
-      </w:r>
-      <w:r>
-        <w:rPr/>
-        <w:t xml:space="preserve">perchÃ©</w:t>
-      </w:r>
-      <w:r>
-        <w:rPr/>
-        <w:t xml:space="preserve"> Ã¨ fallita.</w:t>
+        <w:t xml:space="preserve"> alternativa è stata provata e </w:t>
+      </w:r>
+      <w:r>
+        <w:rPr/>
+        <w:t xml:space="preserve">perché</w:t>
+      </w:r>
+      <w:r>
+        <w:rPr/>
+        <w:t xml:space="preserve"> è fallita.</w:t>
       </w:r>
     </w:p>
     <w:p>
@@ -13457,7 +13513,7 @@
       </w:pPr>
       <w:r>
         <w:rPr/>
-        <w:t xml:space="preserve">Il controllo Ã¨ </w:t>
+        <w:t xml:space="preserve">Il controllo è </w:t>
       </w:r>
       <w:r>
         <w:rPr>
@@ -13583,7 +13639,7 @@
       </w:r>
       <w:r>
         <w:rPr/>
-        <w:t xml:space="preserve">, chiamare un predicato) Ã¨ puro.</w:t>
+        <w:t xml:space="preserve">, chiamare un predicato) è puro.</w:t>
       </w:r>
     </w:p>
     <w:p>
@@ -13614,7 +13670,7 @@
       </w:r>
       <w:r>
         <w:rPr/>
-        <w:t xml:space="preserve"> Ã¨ un effetto: modifica solo valori raggiungibili dall'ambiente locale.</w:t>
+        <w:t xml:space="preserve"> è un effetto: modifica solo valori raggiungibili dall'ambiente locale.</w:t>
       </w:r>
     </w:p>
     <w:p>
@@ -13741,7 +13797,7 @@
       </w:r>
       <w:r>
         <w:rPr/>
-        <w:t xml:space="preserve"> Ã¨ un simbolo; </w:t>
+        <w:t xml:space="preserve"> è un simbolo; </w:t>
       </w:r>
       <w:r>
         <w:rPr/>
@@ -13749,7 +13805,7 @@
       </w:r>
       <w:r>
         <w:rPr/>
-        <w:t xml:space="preserve"> Ã¨ una variabile logica; numeri, stringhe e liste sono se stessi;</w:t>
+        <w:t xml:space="preserve"> è una variabile logica; numeri, stringhe e liste sono se stessi;</w:t>
       </w:r>
     </w:p>
     <w:p>
@@ -13766,7 +13822,7 @@
       </w:r>
       <w:r>
         <w:rPr/>
-        <w:t xml:space="preserve"> Ã¨ un termine composto. Anche </w:t>
+        <w:t xml:space="preserve"> è un termine composto. Anche </w:t>
       </w:r>
       <w:r>
         <w:rPr/>
@@ -13774,7 +13830,7 @@
       </w:r>
       <w:r>
         <w:rPr/>
-        <w:t xml:space="preserve"> Ã¨ un termine (</w:t>
+        <w:t xml:space="preserve"> è un termine (</w:t>
       </w:r>
       <w:r>
         <w:rPr/>
@@ -13815,7 +13871,7 @@
       </w:r>
       <w:r>
         <w:rPr/>
-        <w:t xml:space="preserve"> Ã¨ un valore dell'ambiente corrente, letto al momento in cui viene eseguito </w:t>
+        <w:t xml:space="preserve"> è un valore dell'ambiente corrente, letto al momento in cui viene eseguito </w:t>
       </w:r>
       <w:r>
         <w:rPr/>
@@ -14053,7 +14109,7 @@
               <w:rPr>
                 <w:highlight w:val="lightGray"/>
               </w:rPr>
-              <w:t xml:space="preserve">p(tâ€¦)</w:t>
+              <w:t xml:space="preserve">p(t…)</w:t>
             </w:r>
           </w:p>
         </w:tc>
@@ -14333,7 +14389,7 @@
             </w:pPr>
             <w:r>
               <w:rPr/>
-              <w:t xml:space="preserve">Ã¨ una funzione: nega un </w:t>
+              <w:t xml:space="preserve">è una funzione: nega un </w:t>
             </w:r>
           </w:p>
           <w:p>
@@ -14657,7 +14713,7 @@
               <w:rPr>
                 <w:highlight w:val="lightGray"/>
               </w:rPr>
-              <w:t xml:space="preserve">f(tâ€¦)</w:t>
+              <w:t xml:space="preserve">f(t…)</w:t>
             </w:r>
           </w:p>
           <w:p>
@@ -14799,7 +14855,7 @@
       </w:pPr>
       <w:r>
         <w:rPr/>
-        <w:t xml:space="preserve">Un predicato senza clausole con quell'aritÃ , che non sia nemmeno una funzione, dÃ  </w:t>
+        <w:t xml:space="preserve">Un predicato senza clausole con quell'arità, che non sia nemmeno una funzione, dà </w:t>
       </w:r>
       <w:r>
         <w:rPr/>
@@ -14807,7 +14863,7 @@
       </w:r>
       <w:r>
         <w:rPr/>
-        <w:t xml:space="preserve">. Una variabile non legata dentro un'espressione dÃ  </w:t>
+        <w:t xml:space="preserve">. Una variabile non legata dentro un'espressione dà </w:t>
       </w:r>
       <w:r>
         <w:rPr/>
@@ -14833,7 +14889,7 @@
       </w:r>
       <w:r>
         <w:rPr/>
-        <w:t xml:space="preserve"> Ã¨ un valore</w:t>
+        <w:t xml:space="preserve"> è un valore</w:t>
       </w:r>
     </w:p>
     <w:p>
@@ -14860,7 +14916,7 @@
       </w:r>
       <w:r>
         <w:rPr/>
-        <w:t xml:space="preserve">. Non stampa nulla: Ã¨ un valore come un altro.</w:t>
+        <w:t xml:space="preserve">. Non stampa nulla: è un valore come un altro.</w:t>
       </w:r>
     </w:p>
     <w:p>
@@ -14962,7 +15018,7 @@
       </w:r>
       <w:r>
         <w:rPr/>
-        <w:t xml:space="preserve"> â€” al massimo </w:t>
+        <w:t xml:space="preserve"> — al massimo </w:t>
       </w:r>
       <w:r>
         <w:rPr/>
@@ -14987,7 +15043,7 @@
       </w:r>
       <w:r>
         <w:rPr/>
-        <w:t xml:space="preserve"> â€” i rami piÃ¹ profondi di </w:t>
+        <w:t xml:space="preserve"> — i rami più profondi di </w:t>
       </w:r>
       <w:r>
         <w:rPr/>
@@ -15012,7 +15068,7 @@
       </w:r>
       <w:r>
         <w:rPr/>
-        <w:t xml:space="preserve"> â€” al massimo </w:t>
+        <w:t xml:space="preserve"> — al massimo </w:t>
       </w:r>
       <w:r>
         <w:rPr/>
@@ -15028,7 +15084,7 @@
       </w:r>
       <w:r>
         <w:rPr/>
-        <w:t xml:space="preserve">; il default Ã¨ </w:t>
+        <w:t xml:space="preserve">; il default è </w:t>
       </w:r>
       <w:r>
         <w:rPr/>
@@ -15053,7 +15109,7 @@
       </w:r>
       <w:r>
         <w:rPr/>
-        <w:t xml:space="preserve"> â€” vedi cap. 14.</w:t>
+        <w:t xml:space="preserve"> — vedi cap. 14.</w:t>
       </w:r>
     </w:p>
     <w:p>
@@ -15080,7 +15136,7 @@
       </w:r>
       <w:r>
         <w:rPr/>
-        <w:t xml:space="preserve">: dice se il goal Ã¨ dimostrabile.</w:t>
+        <w:t xml:space="preserve">: dice se il goal è dimostrabile.</w:t>
       </w:r>
     </w:p>
     <w:p>
@@ -15091,7 +15147,7 @@
         <w:rPr>
           <w:rFonts w:ascii="Courier" w:hAnsi="Courier"/>
         </w:rPr>
-        <w:t xml:space="preserve">if grandparent(:alice, :dave)     println("alice Ã¨ nonna di dave") end </w:t>
+        <w:t xml:space="preserve">if grandparent(:alice, :dave)     println("alice è nonna di dave") end </w:t>
       </w:r>
     </w:p>
     <w:p>
@@ -15276,11 +15332,11 @@
       </w:r>
       <w:r>
         <w:rPr/>
-        <w:t xml:space="preserve">. Ãˆ lo stesso albero che il kernel esegue, che </w:t>
-      </w:r>
-      <w:r>
-        <w:rPr/>
-        <w:t xml:space="preserve">:( â€¦ )</w:t>
+        <w:t xml:space="preserve">. È lo stesso albero che il kernel esegue, che </w:t>
+      </w:r>
+      <w:r>
+        <w:rPr/>
+        <w:t xml:space="preserve">:( … )</w:t>
       </w:r>
       <w:r>
         <w:rPr/>
@@ -16182,7 +16238,7 @@
               <w:rPr>
                 <w:highlight w:val="lightGray"/>
               </w:rPr>
-              <w:t xml:space="preserve">(let (tuple â€¦) body)</w:t>
+              <w:t xml:space="preserve">(let (tuple …) body)</w:t>
             </w:r>
           </w:p>
           <w:p>
@@ -16202,7 +16258,7 @@
               <w:rPr>
                 <w:highlight w:val="lightGray"/>
               </w:rPr>
-              <w:t xml:space="preserve">(block â€¦)</w:t>
+              <w:t xml:space="preserve">(block …)</w:t>
             </w:r>
           </w:p>
         </w:tc>
@@ -16226,7 +16282,7 @@
               <w:rPr>
                 <w:highlight w:val="lightGray"/>
               </w:rPr>
-              <w:t xml:space="preserve">function f(a::T)::R !io â€¦ end</w:t>
+              <w:t xml:space="preserve">function f(a::T)::R !io … end</w:t>
             </w:r>
           </w:p>
         </w:tc>
@@ -16316,7 +16372,7 @@
               <w:rPr>
                 <w:highlight w:val="lightGray"/>
               </w:rPr>
-              <w:t xml:space="preserve">macro m(a) â€¦ end</w:t>
+              <w:t xml:space="preserve">macro m(a) … end</w:t>
             </w:r>
           </w:p>
           <w:p>
@@ -16421,7 +16477,7 @@
               <w:rPr>
                 <w:highlight w:val="lightGray"/>
               </w:rPr>
-              <w:t xml:space="preserve">quote â€¦ end</w:t>
+              <w:t xml:space="preserve">quote … end</w:t>
             </w:r>
           </w:p>
           <w:p>
@@ -16482,7 +16538,7 @@
               <w:rPr>
                 <w:highlight w:val="lightGray"/>
               </w:rPr>
-              <w:t xml:space="preserve">(quasi (block â€¦))</w:t>
+              <w:t xml:space="preserve">(quasi (block …))</w:t>
             </w:r>
           </w:p>
           <w:p>
@@ -16701,7 +16757,7 @@
               <w:rPr>
                 <w:highlight w:val="lightGray"/>
               </w:rPr>
-              <w:t xml:space="preserve">with budget(steps = N), trace â€¦ end</w:t>
+              <w:t xml:space="preserve">with budget(steps = N), trace … end</w:t>
             </w:r>
           </w:p>
         </w:tc>
@@ -16811,7 +16867,7 @@
       </w:r>
       <w:r>
         <w:rPr/>
-        <w:t xml:space="preserve"> di un'espressione: se Ã¨ codice viene innestato, se Ã¨ un numero o una lista diventa una costante, se Ã¨ un Symbol diventa un identificatore. </w:t>
+        <w:t xml:space="preserve"> di un'espressione: se è codice viene innestato, se è un numero o una lista diventa una costante, se è un Symbol diventa un identificatore. </w:t>
       </w:r>
       <w:r>
         <w:rPr/>
@@ -16966,7 +17022,7 @@
       </w:pPr>
       <w:r>
         <w:rPr/>
-        <w:t xml:space="preserve">L'espansione Ã¨ </w:t>
+        <w:t xml:space="preserve">L'espansione è </w:t>
       </w:r>
       <w:r>
         <w:rPr>
@@ -16976,13 +17032,13 @@
       </w:r>
       <w:r>
         <w:rPr/>
-        <w:t xml:space="preserve"> (Â§15) e </w:t>
+        <w:t xml:space="preserve"> (§15) e </w:t>
       </w:r>
       <w:r>
         <w:rPr>
           <w:b/>
         </w:rPr>
-        <w:t xml:space="preserve">non Ã¨ igienica</w:t>
+        <w:t xml:space="preserve">non è igienica</w:t>
       </w:r>
       <w:r>
         <w:rPr/>
@@ -17622,7 +17678,7 @@
       </w:r>
       <w:r>
         <w:rPr/>
-        <w:t xml:space="preserve"> Ã¨ piÃ¹ piccolo: </w:t>
+        <w:t xml:space="preserve"> è più piccolo: </w:t>
       </w:r>
       <w:r>
         <w:rPr/>
@@ -17722,7 +17778,7 @@
       </w:r>
       <w:r>
         <w:rPr/>
-        <w:t xml:space="preserve">SPEC-CORE Â§7</w:t>
+        <w:t xml:space="preserve">SPEC-CORE §7</w:t>
       </w:r>
       <w:r>
         <w:rPr/>
@@ -17827,11 +17883,11 @@
       </w:r>
       <w:r>
         <w:rPr/>
-        <w:t xml:space="preserve"> Ã¨ normativa (</w:t>
-      </w:r>
-      <w:r>
-        <w:rPr/>
-        <w:t xml:space="preserve">SPEC Â§14</w:t>
+        <w:t xml:space="preserve"> è normativa (</w:t>
+      </w:r>
+      <w:r>
+        <w:rPr/>
+        <w:t xml:space="preserve">SPEC §14</w:t>
       </w:r>
       <w:r>
         <w:rPr/>
@@ -17875,7 +17931,7 @@
       </w:r>
       <w:r>
         <w:rPr/>
-        <w:t xml:space="preserve"> si puÃ² omettere; lo shebang </w:t>
+        <w:t xml:space="preserve"> si può omettere; lo shebang </w:t>
       </w:r>
       <w:r>
         <w:rPr/>
@@ -17883,7 +17939,7 @@
       </w:r>
       <w:r>
         <w:rPr/>
-        <w:t xml:space="preserve"> Ã¨ ignorato.</w:t>
+        <w:t xml:space="preserve"> è ignorato.</w:t>
       </w:r>
     </w:p>
     <w:p>
@@ -17960,7 +18016,7 @@
       </w:pPr>
       <w:r>
         <w:rPr/>
-        <w:t xml:space="preserve">Il REPL Ã¨ in stile Prolog:</w:t>
+        <w:t xml:space="preserve">Il REPL è in stile Prolog:</w:t>
       </w:r>
     </w:p>
     <w:p>
@@ -17984,7 +18040,7 @@
       </w:pPr>
       <w:r>
         <w:rPr/>
-        <w:t xml:space="preserve">I blocchi restano aperti finchÃ© non sono chiusi da </w:t>
+        <w:t xml:space="preserve">I blocchi restano aperti finché non sono chiusi da </w:t>
       </w:r>
       <w:r>
         <w:rPr/>
@@ -18017,7 +18073,7 @@
       </w:r>
       <w:r>
         <w:rPr/>
-        <w:t xml:space="preserve"> finale Ã¨ facoltativo) esegue una query con le opzioni di </w:t>
+        <w:t xml:space="preserve"> finale è facoltativo) esegue una query con le opzioni di </w:t>
       </w:r>
       <w:r>
         <w:rPr/>
@@ -18070,7 +18126,7 @@
       </w:pPr>
       <w:r>
         <w:rPr/>
-        <w:t xml:space="preserve">Un'istruzione che Ã¨ un goal su un predicato della knowledge base Ã¨ trattata come query.</w:t>
+        <w:t xml:space="preserve">Un'istruzione che è un goal su un predicato della knowledge base è trattata come query.</w:t>
       </w:r>
     </w:p>
     <w:p>
@@ -18140,7 +18196,7 @@
       </w:r>
       <w:r>
         <w:rPr/>
-        <w:t xml:space="preserve">:load FILEâ€¦</w:t>
+        <w:t xml:space="preserve">:load FILE…</w:t>
       </w:r>
       <w:r>
         <w:rPr/>
@@ -18253,7 +18309,7 @@
       </w:pPr>
       <w:r>
         <w:rPr/>
-        <w:t xml:space="preserve">Ctrl-C interrompe il calcolo in corso; un errore non gestito Ã¨ stampato e il REPL continua.</w:t>
+        <w:t xml:space="preserve">Ctrl-C interrompe il calcolo in corso; un errore non gestito è stampato e il REPL continua.</w:t>
       </w:r>
     </w:p>
     <w:p>
@@ -18298,7 +18354,7 @@
       </w:r>
       <w:r>
         <w:rPr/>
-        <w:t xml:space="preserve">SPEC-CORE Â§8</w:t>
+        <w:t xml:space="preserve">SPEC-CORE §8</w:t>
       </w:r>
       <w:r>
         <w:rPr/>
@@ -18535,7 +18591,7 @@
             </w:pPr>
             <w:r>
               <w:rPr/>
-              <w:t xml:space="preserve"> 0â€“255) alla posizione </w:t>
+              <w:t xml:space="preserve"> 0–255) alla posizione </w:t>
             </w:r>
           </w:p>
           <w:p>
@@ -18745,7 +18801,7 @@
       </w:pPr>
       <w:r>
         <w:rPr/>
-        <w:t xml:space="preserve">Un programma puÃ² leggere se stesso con </w:t>
+        <w:t xml:space="preserve">Un programma può leggere se stesso con </w:t>
       </w:r>
       <w:r>
         <w:rPr/>
@@ -18753,7 +18809,7 @@
       </w:r>
       <w:r>
         <w:rPr/>
-        <w:t xml:space="preserve">: Ã¨ il primo passo di un interprete self-hosted.</w:t>
+        <w:t xml:space="preserve">: è il primo passo di un interprete self-hosted.</w:t>
       </w:r>
     </w:p>
     <w:p>
@@ -18878,7 +18934,7 @@
       </w:pPr>
       <w:r>
         <w:rPr/>
-        <w:t xml:space="preserve">In Core non c'Ã¨ </w:t>
+        <w:t xml:space="preserve">In Core non c'è </w:t>
       </w:r>
       <w:r>
         <w:rPr/>
@@ -18886,7 +18942,7 @@
       </w:r>
       <w:r>
         <w:rPr/>
-        <w:t xml:space="preserve">: un record Ã¨ una lista con un simbolo come tag in prima posizione.</w:t>
+        <w:t xml:space="preserve">: un record è una lista con un simbolo come tag in prima posizione.</w:t>
       </w:r>
     </w:p>
     <w:p>
@@ -18938,7 +18994,7 @@
       </w:pPr>
       <w:r>
         <w:rPr/>
-        <w:t xml:space="preserve">Ãˆ la struttura usata dagli interpreti in </w:t>
+        <w:t xml:space="preserve">È la struttura usata dagli interpreti in </w:t>
       </w:r>
       <w:r>
         <w:rPr/>
@@ -18950,7 +19006,7 @@
       </w:r>
       <w:r>
         <w:rPr/>
-        <w:t xml:space="preserve">[nome1, valore1, nome2, valore2, â€¦]</w:t>
+        <w:t xml:space="preserve">[nome1, valore1, nome2, valore2, …]</w:t>
       </w:r>
       <w:r>
         <w:rPr/>
@@ -19006,7 +19062,7 @@
       </w:pPr>
       <w:r>
         <w:rPr/>
-        <w:t xml:space="preserve">PoichÃ© una funzione nominata non puÃ² riassegnare un globale, lo stato condiviso si tiene in una lista mutabile o in una chiusura.</w:t>
+        <w:t xml:space="preserve">Poiché una funzione nominata non può riassegnare un globale, lo stato condiviso si tiene in una lista mutabile o in una chiusura.</w:t>
       </w:r>
     </w:p>
     <w:p>
@@ -19105,7 +19161,7 @@
       </w:pPr>
       <w:r>
         <w:rPr/>
-        <w:t xml:space="preserve">Funzioni piccole con nomi chiari; caso base esplicito in ogni ricorsione; per profonditÃ  grandi preferisci </w:t>
+        <w:t xml:space="preserve">Funzioni piccole con nomi chiari; caso base esplicito in ogni ricorsione; per profondità grandi preferisci </w:t>
       </w:r>
       <w:r>
         <w:rPr/>
@@ -19130,7 +19186,7 @@
       </w:r>
       <w:r>
         <w:rPr/>
-        <w:t xml:space="preserve">i = 1 â€¦ while i &lt;= length(xs)</w:t>
+        <w:t xml:space="preserve">i = 1 … while i &lt;= length(xs)</w:t>
       </w:r>
       <w:r>
         <w:rPr/>
@@ -19213,7 +19269,7 @@
       </w:pPr>
       <w:r>
         <w:rPr/>
-        <w:t xml:space="preserve">Metti le parentesi quando spezzi un'espressione su piÃ¹ righe.</w:t>
+        <w:t xml:space="preserve">Metti le parentesi quando spezzi un'espressione su più righe.</w:t>
       </w:r>
     </w:p>
     <w:p>
@@ -19235,16 +19291,16 @@
       </w:pPr>
       <w:r>
         <w:rPr/>
-        <w:t xml:space="preserve">Parte II â€” Esercizi</w:t>
-      </w:r>
-    </w:p>
-    <w:p>
-      <w:pPr>
-        <w:spacing w:lineRule="auto"/>
-      </w:pPr>
-      <w:r>
-        <w:rPr/>
-        <w:t xml:space="preserve">Ogni esercizio ha una soluzione verificata. Prova prima, poi apri il riquadro Â«SoluzioneÂ».</w:t>
+        <w:t xml:space="preserve">Parte II — Esercizi</w:t>
+      </w:r>
+    </w:p>
+    <w:p>
+      <w:pPr>
+        <w:spacing w:lineRule="auto"/>
+      </w:pPr>
+      <w:r>
+        <w:rPr/>
+        <w:t xml:space="preserve">Ogni esercizio ha una soluzione verificata. Prova prima, poi apri il riquadro «Soluzione».</w:t>
       </w:r>
     </w:p>
     <w:p>
@@ -19276,7 +19332,7 @@
       </w:pPr>
       <w:r>
         <w:rPr/>
-        <w:t xml:space="preserve">Esercizio 1 â€” Potenza e somme</w:t>
+        <w:t xml:space="preserve">Esercizio 1 — Potenza e somme</w:t>
       </w:r>
     </w:p>
     <w:p>
@@ -19313,7 +19369,7 @@
       </w:r>
       <w:r>
         <w:rPr/>
-        <w:t xml:space="preserve">1 + â€¦ + n</w:t>
+        <w:t xml:space="preserve">1 + … + n</w:t>
       </w:r>
       <w:r>
         <w:rPr/>
@@ -19401,7 +19457,7 @@
       </w:pPr>
       <w:r>
         <w:rPr/>
-        <w:t xml:space="preserve">Esercizio 2 â€” Numeri primi</w:t>
+        <w:t xml:space="preserve">Esercizio 2 — Numeri primi</w:t>
       </w:r>
     </w:p>
     <w:p>
@@ -19462,7 +19518,7 @@
       </w:pPr>
       <w:r>
         <w:rPr/>
-        <w:t xml:space="preserve">Esercizio 3 â€” Inverti una lista</w:t>
+        <w:t xml:space="preserve">Esercizio 3 — Inverti una lista</w:t>
       </w:r>
     </w:p>
     <w:p>
@@ -19531,7 +19587,7 @@
       </w:pPr>
       <w:r>
         <w:rPr/>
-        <w:t xml:space="preserve">Esercizio 4 â€” Ordinamento per inserzione</w:t>
+        <w:t xml:space="preserve">Esercizio 4 — Ordinamento per inserzione</w:t>
       </w:r>
     </w:p>
     <w:p>
@@ -19617,7 +19673,7 @@
       </w:pPr>
       <w:r>
         <w:rPr/>
-        <w:t xml:space="preserve">Esercizio 5 â€” Contatore di parole</w:t>
+        <w:t xml:space="preserve">Esercizio 5 — Contatore di parole</w:t>
       </w:r>
     </w:p>
     <w:p>
@@ -19694,7 +19750,7 @@
       </w:pPr>
       <w:r>
         <w:rPr/>
-        <w:t xml:space="preserve">Esercizio 6 â€” Un mini-tokenizer</w:t>
+        <w:t xml:space="preserve">Esercizio 6 — Un mini-tokenizer</w:t>
       </w:r>
     </w:p>
     <w:p>
@@ -19743,7 +19799,7 @@
       </w:r>
       <w:r>
         <w:rPr/>
-        <w:t xml:space="preserve">. Ãˆ il primo passo di un interprete.</w:t>
+        <w:t xml:space="preserve">. È il primo passo di un interprete.</w:t>
       </w:r>
     </w:p>
     <w:p>
@@ -19795,7 +19851,7 @@
       </w:pPr>
       <w:r>
         <w:rPr/>
-        <w:t xml:space="preserve">Esercizio 7 â€” Valutare un'espressione</w:t>
+        <w:t xml:space="preserve">Esercizio 7 — Valutare un'espressione</w:t>
       </w:r>
     </w:p>
     <w:p>
@@ -19828,7 +19884,7 @@
       </w:r>
       <w:r>
         <w:rPr/>
-        <w:t xml:space="preserve">, cosÃ¬ le funzioni possono aggiornarla.</w:t>
+        <w:t xml:space="preserve">, così le funzioni possono aggiornarla.</w:t>
       </w:r>
     </w:p>
     <w:p>
@@ -19880,7 +19936,7 @@
       </w:pPr>
       <w:r>
         <w:rPr/>
-        <w:t xml:space="preserve">Esercizio 8 â€” Un ambiente a dizionario</w:t>
+        <w:t xml:space="preserve">Esercizio 8 — Un ambiente a dizionario</w:t>
       </w:r>
     </w:p>
     <w:p>
@@ -20022,7 +20078,7 @@
       </w:pPr>
       <w:r>
         <w:rPr/>
-        <w:t xml:space="preserve">Esercizio 9 â€” Dispatch su struct</w:t>
+        <w:t xml:space="preserve">Esercizio 9 — Dispatch su struct</w:t>
       </w:r>
     </w:p>
     <w:p>
@@ -20079,7 +20135,7 @@
       </w:r>
       <w:r>
         <w:rPr/>
-        <w:t xml:space="preserve">. Verifica che il metodo piÃ¹ specifico vinca.</w:t>
+        <w:t xml:space="preserve">. Verifica che il metodo più specifico vinca.</w:t>
       </w:r>
     </w:p>
     <w:p>
@@ -20131,7 +20187,7 @@
       </w:pPr>
       <w:r>
         <w:rPr/>
-        <w:t xml:space="preserve">Esercizio 10 â€” Una base di conoscenza</w:t>
+        <w:t xml:space="preserve">Esercizio 10 — Una base di conoscenza</w:t>
       </w:r>
     </w:p>
     <w:p>
@@ -20232,7 +20288,7 @@
       </w:pPr>
       <w:r>
         <w:rPr/>
-        <w:t xml:space="preserve">Esercizio 11 â€” Contratti in pratica</w:t>
+        <w:t xml:space="preserve">Esercizio 11 — Contratti in pratica</w:t>
       </w:r>
     </w:p>
     <w:p>
@@ -20325,7 +20381,7 @@
       </w:pPr>
       <w:r>
         <w:rPr/>
-        <w:t xml:space="preserve">Esercizio 12 â€” Una macro che misura</w:t>
+        <w:t xml:space="preserve">Esercizio 12 — Una macro che misura</w:t>
       </w:r>
     </w:p>
     <w:p>
@@ -20406,7 +20462,7 @@
       </w:pPr>
       <w:r>
         <w:rPr/>
-        <w:t xml:space="preserve">Parte III â€” Riferimento</w:t>
+        <w:t xml:space="preserve">Parte III — Riferimento</w:t>
       </w:r>
     </w:p>
     <w:p>
@@ -20470,7 +20526,7 @@
         <w:rPr>
           <w:rFonts w:ascii="Courier" w:hAnsi="Courier"/>
         </w:rPr>
-        <w:t xml:space="preserve">program    = { sep } { stmt sep { sep } } ; sep        = NEWLINE | ";" ; block      = { sep } { stmt sep { sep } } ;  stmt       = funcdef | structdef | macrodef | fact | rule            | "requires" expr | "ensures" expr            | "return" [ expr ] | "break" | "continue"            | "(" NAME { "," NAME } ")" "=" expr            | expr ;  funcdef    = "function" fname "(" [ params ] ")" [ "::" TYPE ] [ "!" EFFECT { "," EFFECT } ]              block "end"            | NAME "(" [ params ] ")" "=" expr ; fname      = NAME | "+" | "-" | "*" | "/" | "%" | "^" | "==" | "&lt;" | "&lt;=" | "&gt;" | "&gt;=" ; params     = param { "," param } ; param      = NAME [ "::" TYPE ] | "(" NAME { "," NAME } ")" ; structdef  = "struct" NAME sep { NAME [ "::" TYPE ] sep } "end" ; macrodef   = "macro" NAME "(" [ NAME { "," NAME } ] ")" block "end" ;  fact       = "fact" term ; rule       = "rule" term [ ":-" goal { "," goal } ] ;  expr       = (* Pratt: precedenze dalla piÃ¹ bassa alla piÃ¹ alta *)   1  a = b   a += b   a -= b   a *= b                 (destra)   2  x -&gt; e   (a, b) -&gt; e   c ? a : b                 (destra)   3  ||   4  &amp;&amp;   5  ==  !=  &lt;  &lt;=  &gt;  &gt;=  in  isa  is   6  a:b                                               (range, senza spazi)   7  +  -   8  *  /  %   9  -x  !x  +x  $x                                    (unari)  10  ^                                                 (destra)  11  e::T                                              (asserzione di tipo)  12  f(args)  xs[i]  a.campo                           (postfissi, senza spazio prima di ( e [)  primary    = NUMBER | STRING | SYMBOL | LVAR | NAME | "true" | "false" | "nothing"            | "(" expr ")" | "(" expr "," ... ")"       (* tupla: parametri di lambda *)            | "[" [ expr { "," expr } [ "|" expr ] ] "]"            | "[" expr "for" NAME "in" expr [ "if" expr ] "]"            | ":(" expr ")" | "quote" block "end"            | "@" NAME "(" args ")"            | "if" expr block { "elseif" expr block } [ "else" block ] "end"            | "while" expr block "end"            | "for" NAME "in" expr block "end"            | "for" "(" NAME { "," NAME } ")" "in" expr block "end"            | "let" [ NAME "=" expr { "," NAME "=" expr } ] block "end"            | "begin" block "end"            | "try" block [ "catch" [ NAME ] block ] "end"            | "with" modifier { "," modifier } block "end"            | "solve" goal { "limit" expr | "depth" expr | "steps" expr | "trace" }            | "function" "(" params ")" block "end" ; modifier   = "budget" "(" "steps" "=" expr ")" | "trace" ; </w:t>
+        <w:t xml:space="preserve">program    = { sep } { stmt sep { sep } } ; sep        = NEWLINE | ";" ; block      = { sep } { stmt sep { sep } } ;  stmt       = funcdef | structdef | macrodef | fact | rule            | "requires" expr | "ensures" expr            | "return" [ expr ] | "break" | "continue"            | "(" NAME { "," NAME } ")" "=" expr            | expr ;  funcdef    = "function" fname "(" [ params ] ")" [ "::" TYPE ] [ "!" EFFECT { "," EFFECT } ]              block "end"            | NAME "(" [ params ] ")" "=" expr ; fname      = NAME | "+" | "-" | "*" | "/" | "%" | "^" | "==" | "&lt;" | "&lt;=" | "&gt;" | "&gt;=" ; params     = param { "," param } ; param      = NAME [ "::" TYPE ] | "(" NAME { "," NAME } ")" ; structdef  = "struct" NAME sep { NAME [ "::" TYPE ] sep } "end" ; macrodef   = "macro" NAME "(" [ NAME { "," NAME } ] ")" block "end" ;  fact       = "fact" term ; rule       = "rule" term [ ":-" goal { "," goal } ] ;  expr       = (* Pratt: precedenze dalla più bassa alla più alta *)   1  a = b   a += b   a -= b   a *= b                 (destra)   2  x -&gt; e   (a, b) -&gt; e   c ? a : b                 (destra)   3  ||   4  &amp;&amp;   5  ==  !=  &lt;  &lt;=  &gt;  &gt;=  in  isa  is   6  a:b                                               (range, senza spazi)   7  +  -   8  *  /  %   9  -x  !x  +x  $x                                    (unari)  10  ^                                                 (destra)  11  e::T                                              (asserzione di tipo)  12  f(args)  xs[i]  a.campo                           (postfissi, senza spazio prima di ( e [)  primary    = NUMBER | STRING | SYMBOL | LVAR | NAME | "true" | "false" | "nothing"            | "(" expr ")" | "(" expr "," ... ")"       (* tupla: parametri di lambda *)            | "[" [ expr { "," expr } [ "|" expr ] ] "]"            | "[" expr "for" NAME "in" expr [ "if" expr ] "]"            | ":(" expr ")" | "quote" block "end"            | "@" NAME "(" args ")"            | "if" expr block { "elseif" expr block } [ "else" block ] "end"            | "while" expr block "end"            | "for" NAME "in" expr block "end"            | "for" "(" NAME { "," NAME } ")" "in" expr block "end"            | "let" [ NAME "=" expr { "," NAME "=" expr } ] block "end"            | "begin" block "end"            | "try" block [ "catch" [ NAME ] block ] "end"            | "with" modifier { "," modifier } block "end"            | "solve" goal { "limit" expr | "depth" expr | "steps" expr | "trace" }            | "function" "(" params ")" block "end" ; modifier   = "budget" "(" "steps" "=" expr ")" | "trace" ; </w:t>
       </w:r>
     </w:p>
     <w:p>
@@ -21195,7 +21251,7 @@
               <w:rPr>
                 <w:highlight w:val="lightGray"/>
               </w:rPr>
-              <w:t xml:space="preserve">quote â€¦ end</w:t>
+              <w:t xml:space="preserve">quote … end</w:t>
             </w:r>
           </w:p>
         </w:tc>
@@ -21323,7 +21379,7 @@
               <w:rPr>
                 <w:highlight w:val="lightGray"/>
               </w:rPr>
-              <w:t xml:space="preserve">if c â€¦ elseif d â€¦ else â€¦ end</w:t>
+              <w:t xml:space="preserve">if c … elseif d … else … end</w:t>
             </w:r>
           </w:p>
         </w:tc>
@@ -21409,7 +21465,7 @@
               <w:rPr>
                 <w:highlight w:val="lightGray"/>
               </w:rPr>
-              <w:t xml:space="preserve">while c â€¦ end</w:t>
+              <w:t xml:space="preserve">while c … end</w:t>
             </w:r>
           </w:p>
           <w:p>
@@ -21429,18 +21485,18 @@
             </w:pPr>
             <w:r>
               <w:rPr/>
-              <w:t xml:space="preserve"> Â· </w:t>
-            </w:r>
-          </w:p>
-          <w:p>
-            <w:pPr>
-              <w:spacing w:lineRule="auto"/>
-            </w:pPr>
-            <w:r>
-              <w:rPr>
-                <w:highlight w:val="lightGray"/>
-              </w:rPr>
-              <w:t xml:space="preserve">for x in xs â€¦ end</w:t>
+              <w:t xml:space="preserve"> · </w:t>
+            </w:r>
+          </w:p>
+          <w:p>
+            <w:pPr>
+              <w:spacing w:lineRule="auto"/>
+            </w:pPr>
+            <w:r>
+              <w:rPr>
+                <w:highlight w:val="lightGray"/>
+              </w:rPr>
+              <w:t xml:space="preserve">for x in xs … end</w:t>
             </w:r>
           </w:p>
           <w:p>
@@ -21623,7 +21679,7 @@
               <w:rPr>
                 <w:highlight w:val="lightGray"/>
               </w:rPr>
-              <w:t xml:space="preserve">let x = 1 â€¦ end</w:t>
+              <w:t xml:space="preserve">let x = 1 … end</w:t>
             </w:r>
           </w:p>
         </w:tc>
@@ -21666,7 +21722,7 @@
               <w:rPr>
                 <w:highlight w:val="lightGray"/>
               </w:rPr>
-              <w:t xml:space="preserve">begin â€¦ end</w:t>
+              <w:t xml:space="preserve">begin … end</w:t>
             </w:r>
           </w:p>
         </w:tc>
@@ -21945,7 +22001,7 @@
               <w:rPr>
                 <w:highlight w:val="lightGray"/>
               </w:rPr>
-              <w:t xml:space="preserve">function f(x) â€¦ end</w:t>
+              <w:t xml:space="preserve">function f(x) … end</w:t>
             </w:r>
           </w:p>
         </w:tc>
@@ -21999,7 +22055,7 @@
               <w:rPr>
                 <w:highlight w:val="lightGray"/>
               </w:rPr>
-              <w:t xml:space="preserve">function f(x)::Float â€¦ end</w:t>
+              <w:t xml:space="preserve">function f(x)::Float … end</w:t>
             </w:r>
           </w:p>
         </w:tc>
@@ -22053,7 +22109,7 @@
               <w:rPr>
                 <w:highlight w:val="lightGray"/>
               </w:rPr>
-              <w:t xml:space="preserve">function f(x) !io â€¦ end</w:t>
+              <w:t xml:space="preserve">function f(x) !io … end</w:t>
             </w:r>
           </w:p>
         </w:tc>
@@ -22283,7 +22339,7 @@
       </w:r>
       <w:r>
         <w:rPr/>
-        <w:t xml:space="preserve"> nÃ© valori </w:t>
+        <w:t xml:space="preserve"> né valori </w:t>
       </w:r>
       <w:r>
         <w:rPr/>
@@ -22309,7 +22365,7 @@
       </w:r>
       <w:r>
         <w:rPr/>
-        <w:t xml:space="preserve"> e un messaggio diagnostico su stderr. Quello giÃ  stampato su stdout resta.</w:t>
+        <w:t xml:space="preserve"> e un messaggio diagnostico su stderr. Quello già stampato su stdout resta.</w:t>
       </w:r>
     </w:p>
     <w:tbl>
@@ -22397,7 +22453,7 @@
               <w:rPr>
                 <w:highlight w:val="lightGray"/>
               </w:rPr>
-              <w:t xml:space="preserve">parse error: unexpected token â€¦</w:t>
+              <w:t xml:space="preserve">parse error: unexpected token …</w:t>
             </w:r>
           </w:p>
           <w:p>
@@ -22417,7 +22473,7 @@
               <w:rPr>
                 <w:highlight w:val="lightGray"/>
               </w:rPr>
-              <w:t xml:space="preserve">parse error: expected â€¦</w:t>
+              <w:t xml:space="preserve">parse error: expected …</w:t>
             </w:r>
           </w:p>
         </w:tc>
@@ -22487,7 +22543,7 @@
               <w:rPr>
                 <w:highlight w:val="lightGray"/>
               </w:rPr>
-              <w:t xml:space="preserve">() -&gt; â€¦</w:t>
+              <w:t xml:space="preserve">() -&gt; …</w:t>
             </w:r>
           </w:p>
           <w:p>
@@ -22602,7 +22658,7 @@
             </w:pPr>
             <w:r>
               <w:rPr/>
-              <w:t xml:space="preserve">si chiama un valore che non Ã¨ una funzione (</w:t>
+              <w:t xml:space="preserve">si chiama un valore che non è una funzione (</w:t>
             </w:r>
           </w:p>
           <w:p>
@@ -23088,7 +23144,7 @@
               <w:rPr>
                 <w:highlight w:val="lightGray"/>
               </w:rPr>
-              <w:t xml:space="preserve">cannot read file: â€¦</w:t>
+              <w:t xml:space="preserve">cannot read file: …</w:t>
             </w:r>
           </w:p>
         </w:tc>
@@ -23209,7 +23265,7 @@
       </w:r>
       <w:r>
         <w:rPr/>
-        <w:t xml:space="preserve">riga N: â€¦</w:t>
+        <w:t xml:space="preserve">riga N: …</w:t>
       </w:r>
       <w:r>
         <w:rPr/>
@@ -23370,7 +23426,7 @@
             </w:pPr>
             <w:r>
               <w:rPr/>
-              <w:t xml:space="preserve">; Ã¨ anche ciÃ² che il kernel esegue</w:t>
+              <w:t xml:space="preserve">; è anche ciò che il kernel esegue</w:t>
             </w:r>
           </w:p>
         </w:tc>
@@ -23636,7 +23692,7 @@
             </w:pPr>
             <w:r>
               <w:rPr/>
-              <w:t xml:space="preserve">funzione che cattura l'ambiente in cui Ã¨ stata creata</w:t>
+              <w:t xml:space="preserve">funzione che cattura l'ambiente in cui è stata creata</w:t>
             </w:r>
           </w:p>
         </w:tc>
@@ -23742,7 +23798,7 @@
             </w:pPr>
             <w:r>
               <w:rPr/>
-              <w:t xml:space="preserve">capacitÃ  dichiarata di una funzione: </w:t>
+              <w:t xml:space="preserve">capacità dichiarata di una funzione: </w:t>
             </w:r>
           </w:p>
           <w:p>
@@ -24199,7 +24255,7 @@
             </w:pPr>
             <w:r>
               <w:rPr/>
-              <w:t xml:space="preserve">un nome Ã¨ visibile dove Ã¨ stato legato e all'interno, mai all'esterno</w:t>
+              <w:t xml:space="preserve">un nome è visibile dove è stato legato e all'interno, mai all'esterno</w:t>
             </w:r>
           </w:p>
         </w:tc>
@@ -24433,7 +24489,7 @@
       </w:pPr>
       <w:r>
         <w:rPr/>
-        <w:t xml:space="preserve">Questa sezione non fa parte del linguaggio: Ã¨ lo stato dell'implementazione,useful per orientarsi prima di scrivere codice.</w:t>
+        <w:t xml:space="preserve">Questa sezione non fa parte del linguaggio: è lo stato dell'implementazione,useful per orientarsi prima di scrivere codice.</w:t>
       </w:r>
     </w:p>
     <w:tbl>
@@ -24769,7 +24825,7 @@
             </w:pPr>
             <w:r>
               <w:rPr/>
-              <w:t xml:space="preserve">funzionalitÃ</w:t>
+              <w:t xml:space="preserve">funzionalità</w:t>
             </w:r>
           </w:p>
         </w:tc>
@@ -24895,7 +24951,7 @@
             </w:pPr>
             <w:r>
               <w:rPr/>
-              <w:t xml:space="preserve">sÃ¬</w:t>
+              <w:t xml:space="preserve">sì</w:t>
             </w:r>
           </w:p>
         </w:tc>
@@ -24955,7 +25011,7 @@
             </w:pPr>
             <w:r>
               <w:rPr/>
-              <w:t xml:space="preserve">piÃ¹ parametri</w:t>
+              <w:t xml:space="preserve">più parametri</w:t>
             </w:r>
           </w:p>
         </w:tc>
@@ -25407,7 +25463,7 @@
             </w:pPr>
             <w:r>
               <w:rPr/>
-              <w:t xml:space="preserve">sÃ¬</w:t>
+              <w:t xml:space="preserve">sì</w:t>
             </w:r>
           </w:p>
         </w:tc>
@@ -25528,7 +25584,7 @@
       </w:r>
       <w:r>
         <w:rPr/>
-        <w:t xml:space="preserve">; se deve girare anche sul seed, restringiti alle funzionalitÃ  elencate nella colonna di destra e verificalo su Windows.</w:t>
+        <w:t xml:space="preserve">; se deve girare anche sul seed, restringiti alle funzionalità elencate nella colonna di destra e verificalo su Windows.</w:t>
       </w:r>
     </w:p>
     <w:p>
@@ -25576,11 +25632,11 @@
       </w:r>
       <w:r>
         <w:rPr/>
-        <w:t xml:space="preserve">SPEC Â§1</w:t>
-      </w:r>
-      <w:r>
-        <w:rPr/>
-        <w:t xml:space="preserve"> per Triad-Full (a capo dentro le parentesi, o subito dopo un operatore binario) non Ã¨ implementata nell'interprete di riferimento. Scrivere una istruzione per riga;</w:t>
+        <w:t xml:space="preserve">SPEC §1</w:t>
+      </w:r>
+      <w:r>
+        <w:rPr/>
+        <w:t xml:space="preserve"> per Triad-Full (a capo dentro le parentesi, o subito dopo un operatore binario) non è implementata nell'interprete di riferimento. Scrivere una istruzione per riga;</w:t>
       </w:r>
     </w:p>
     <w:p>
@@ -25605,7 +25661,7 @@
       </w:r>
       <w:r>
         <w:rPr/>
-        <w:t xml:space="preserve">: lÃ¬ c'Ã¨ l'helper non standard </w:t>
+        <w:t xml:space="preserve">: lì c'è l'helper non standard </w:t>
       </w:r>
       <w:r>
         <w:rPr/>
@@ -25645,7 +25701,7 @@
       </w:pPr>
       <w:r>
         <w:rPr/>
-        <w:t xml:space="preserve">Appendice A â€” Influenze dichiarate</w:t>
+        <w:t xml:space="preserve">Appendice A — Influenze dichiarate</w:t>
       </w:r>
     </w:p>
     <w:p>
@@ -25660,11 +25716,11 @@
         <w:rPr>
           <w:b/>
         </w:rPr>
-        <w:t xml:space="preserve">non Ã¨ un dialetto di nessuno dei tre</w:t>
-      </w:r>
-      <w:r>
-        <w:rPr/>
-        <w:t xml:space="preserve">: la definizione del linguaggio Ã¨ la specifica.</w:t>
+        <w:t xml:space="preserve">non è un dialetto di nessuno dei tre</w:t>
+      </w:r>
+      <w:r>
+        <w:rPr/>
+        <w:t xml:space="preserve">: la definizione del linguaggio è la specifica.</w:t>
       </w:r>
     </w:p>
     <w:tbl>
@@ -25780,7 +25836,7 @@
               <w:rPr>
                 <w:highlight w:val="lightGray"/>
               </w:rPr>
-              <w:t xml:space="preserve">function â€¦ end</w:t>
+              <w:t xml:space="preserve">function … end</w:t>
             </w:r>
           </w:p>
           <w:p>
@@ -26055,7 +26111,7 @@
               <w:rPr>
                 <w:highlight w:val="lightGray"/>
               </w:rPr>
-              <w:t xml:space="preserve">:( â€¦ )</w:t>
+              <w:t xml:space="preserve">:( … )</w:t>
             </w:r>
           </w:p>
           <w:p>
@@ -26152,7 +26208,7 @@
       </w:pPr>
       <w:r>
         <w:rPr/>
-        <w:t xml:space="preserve">Appendice B â€” Dove guardare</w:t>
+        <w:t xml:space="preserve">Appendice B — Dove guardare</w:t>
       </w:r>
     </w:p>
     <w:tbl>
@@ -26493,7 +26549,7 @@
             </w:pPr>
             <w:r>
               <w:rPr/>
-              <w:t xml:space="preserve"> Â· </w:t>
+              <w:t xml:space="preserve"> · </w:t>
             </w:r>
           </w:p>
           <w:p>
@@ -26560,7 +26616,7 @@
             </w:pPr>
             <w:r>
               <w:rPr/>
-              <w:t xml:space="preserve"> Â· </w:t>
+              <w:t xml:space="preserve"> · </w:t>
             </w:r>
           </w:p>
           <w:p>
@@ -26672,7 +26728,7 @@
             </w:pPr>
             <w:r>
               <w:rPr/>
-              <w:t xml:space="preserve"> â€” MIT</w:t>
+              <w:t xml:space="preserve"> — MIT</w:t>
             </w:r>
           </w:p>
         </w:tc>
@@ -59097,6 +59153,23 @@
     </w:p>
   </w:body>
 </w:document>
+</file>
+
+<file path=word/footer1.xml><?xml version="1.0" encoding="utf-8"?>
+<ftr xmlns="http://schemas.openxmlformats.org/wordprocessingml/2006/main">
+  <p>
+    <pPr>
+      <jc xmlns:ns1="http://schemas.openxmlformats.org/wordprocessingml/2006/main" ns1:val="center"/>
+      <spacing xmlns:ns2="http://schemas.openxmlformats.org/wordprocessingml/2006/main" ns2:lineRule="auto"/>
+    </pPr>
+    <r>
+      <rPr/>
+    </r>
+    <fldSimple xmlns:ns3="http://schemas.openxmlformats.org/wordprocessingml/2006/main" ns3:instr="PAGE">
+      <r/>
+    </fldSimple>
+  </p>
+</ftr>
 </file>
 
 <file path=word/numbering.xml><?xml version="1.0" encoding="utf-8"?>

</xml_diff>